<commit_message>
feat: Add role-based chatbot context injection engine
</commit_message>
<xml_diff>
--- a/Resources/Technical_Documentation_Amypo.docx
+++ b/Resources/Technical_Documentation_Amypo.docx
@@ -1,6 +1,6 @@
 
 <file path=word/document.xml><?xml version="1.0" encoding="utf-8"?>
-<w:document xmlns:wpc="http://schemas.microsoft.com/office/word/2010/wordprocessingCanvas" xmlns:cx="http://schemas.microsoft.com/office/drawing/2014/chartex" xmlns:cx1="http://schemas.microsoft.com/office/drawing/2015/9/8/chartex" xmlns:cx2="http://schemas.microsoft.com/office/drawing/2015/10/21/chartex" xmlns:cx3="http://schemas.microsoft.com/office/drawing/2016/5/9/chartex" xmlns:cx4="http://schemas.microsoft.com/office/drawing/2016/5/10/chartex" xmlns:cx5="http://schemas.microsoft.com/office/drawing/2016/5/11/chartex" xmlns:cx6="http://schemas.microsoft.com/office/drawing/2016/5/12/chartex" xmlns:cx7="http://schemas.microsoft.com/office/drawing/2016/5/13/chartex" xmlns:cx8="http://schemas.microsoft.com/office/drawing/2016/5/14/chartex" xmlns:mc="http://schemas.openxmlformats.org/markup-compatibility/2006" xmlns:aink="http://schemas.microsoft.com/office/drawing/2016/ink" xmlns:am3d="http://schemas.microsoft.com/office/drawing/2017/model3d" xmlns:o="urn:schemas-microsoft-com:office:office" xmlns:oel="http://schemas.microsoft.com/office/2019/extlst" xmlns:r="http://schemas.openxmlformats.org/officeDocument/2006/relationships" xmlns:m="http://schemas.openxmlformats.org/officeDocument/2006/math" xmlns:v="urn:schemas-microsoft-com:vml" xmlns:wp14="http://schemas.microsoft.com/office/word/2010/wordprocessingDrawing" xmlns:wp="http://schemas.openxmlformats.org/drawingml/2006/wordprocessingDrawing" xmlns:w10="urn:schemas-microsoft-com:office:word" xmlns:w="http://schemas.openxmlformats.org/wordprocessingml/2006/main" xmlns:w14="http://schemas.microsoft.com/office/word/2010/wordml" xmlns:w15="http://schemas.microsoft.com/office/word/2012/wordml" xmlns:w16cei="http://schemas.microsoft.com/office/word/2026/wordml/cei" xmlns:w16cex="http://schemas.microsoft.com/office/word/2018/wordml/cex" xmlns:w16cid="http://schemas.microsoft.com/office/word/2016/wordml/cid" xmlns:w16="http://schemas.microsoft.com/office/word/2018/wordml" xmlns:w16du="http://schemas.microsoft.com/office/word/2023/wordml/word16du" xmlns:w16sdtdh="http://schemas.microsoft.com/office/word/2020/wordml/sdtdatahash" xmlns:w16sdtfl="http://schemas.microsoft.com/office/word/2024/wordml/sdtformatlock" xmlns:w16se="http://schemas.microsoft.com/office/word/2015/wordml/symex" xmlns:wpg="http://schemas.microsoft.com/office/word/2010/wordprocessingGroup" xmlns:wpi="http://schemas.microsoft.com/office/word/2010/wordprocessingInk" xmlns:wne="http://schemas.microsoft.com/office/word/2006/wordml" xmlns:wps="http://schemas.microsoft.com/office/word/2010/wordprocessingShape" mc:Ignorable="w14 w15 w16se w16cid w16 w16cex w16sdtdh w16sdtfl w16du wp14">
+<w:document xmlns:wpc="http://schemas.microsoft.com/office/word/2010/wordprocessingCanvas" xmlns:cx="http://schemas.microsoft.com/office/drawing/2014/chartex" xmlns:cx1="http://schemas.microsoft.com/office/drawing/2015/9/8/chartex" xmlns:cx2="http://schemas.microsoft.com/office/drawing/2015/10/21/chartex" xmlns:cx3="http://schemas.microsoft.com/office/drawing/2016/5/9/chartex" xmlns:cx4="http://schemas.microsoft.com/office/drawing/2016/5/10/chartex" xmlns:cx5="http://schemas.microsoft.com/office/drawing/2016/5/11/chartex" xmlns:cx6="http://schemas.microsoft.com/office/drawing/2016/5/12/chartex" xmlns:cx7="http://schemas.microsoft.com/office/drawing/2016/5/13/chartex" xmlns:cx8="http://schemas.microsoft.com/office/drawing/2016/5/14/chartex" xmlns:mc="http://schemas.openxmlformats.org/markup-compatibility/2006" xmlns:aink="http://schemas.microsoft.com/office/drawing/2016/ink" xmlns:am3d="http://schemas.microsoft.com/office/drawing/2017/model3d" xmlns:o="urn:schemas-microsoft-com:office:office" xmlns:oel="http://schemas.microsoft.com/office/2019/extlst" xmlns:r="http://schemas.openxmlformats.org/officeDocument/2006/relationships" xmlns:m="http://schemas.openxmlformats.org/officeDocument/2006/math" xmlns:v="urn:schemas-microsoft-com:vml" xmlns:wp14="http://schemas.microsoft.com/office/word/2010/wordprocessingDrawing" xmlns:wp="http://schemas.openxmlformats.org/drawingml/2006/wordprocessingDrawing" xmlns:w10="urn:schemas-microsoft-com:office:word" xmlns:w="http://schemas.openxmlformats.org/wordprocessingml/2006/main" xmlns:w14="http://schemas.microsoft.com/office/word/2010/wordml" xmlns:w15="http://schemas.microsoft.com/office/word/2012/wordml" xmlns:w16cex="http://schemas.microsoft.com/office/word/2018/wordml/cex" xmlns:w16cid="http://schemas.microsoft.com/office/word/2016/wordml/cid" xmlns:w16="http://schemas.microsoft.com/office/word/2018/wordml" xmlns:w16du="http://schemas.microsoft.com/office/word/2023/wordml/word16du" xmlns:w16sdtdh="http://schemas.microsoft.com/office/word/2020/wordml/sdtdatahash" xmlns:w16sdtfl="http://schemas.microsoft.com/office/word/2024/wordml/sdtformatlock" xmlns:w16se="http://schemas.microsoft.com/office/word/2015/wordml/symex" xmlns:wpg="http://schemas.microsoft.com/office/word/2010/wordprocessingGroup" xmlns:wpi="http://schemas.microsoft.com/office/word/2010/wordprocessingInk" xmlns:wne="http://schemas.microsoft.com/office/word/2006/wordml" xmlns:wps="http://schemas.microsoft.com/office/word/2010/wordprocessingShape" mc:Ignorable="w14 w15 w16se w16cid w16 w16cex w16sdtdh w16sdtfl w16du wp14">
   <w:body>
     <w:p>
       <w:pPr>
@@ -47,7 +47,29 @@
           <w:sz w:val="24"/>
           <w:szCs w:val="24"/>
         </w:rPr>
-        <w:t>Stage 1 — Approach, Architecture &amp; Module Breakdown</w:t>
+        <w:t xml:space="preserve">Stage </w:t>
+      </w:r>
+      <w:r>
+        <w:rPr>
+          <w:rFonts w:ascii="Calibri" w:eastAsia="Calibri" w:hAnsi="Calibri" w:cs="Calibri"/>
+          <w:i/>
+          <w:iCs/>
+          <w:color w:val="6B7785"/>
+          <w:sz w:val="24"/>
+          <w:szCs w:val="24"/>
+        </w:rPr>
+        <w:t>2</w:t>
+      </w:r>
+      <w:r>
+        <w:rPr>
+          <w:rFonts w:ascii="Calibri" w:eastAsia="Calibri" w:hAnsi="Calibri" w:cs="Calibri"/>
+          <w:i/>
+          <w:iCs/>
+          <w:color w:val="6B7785"/>
+          <w:sz w:val="24"/>
+          <w:szCs w:val="24"/>
+        </w:rPr>
+        <w:t xml:space="preserve"> — Approach, Architecture &amp; Module Breakdown</w:t>
       </w:r>
     </w:p>
     <w:tbl>
@@ -67,12 +89,6 @@
         <w:gridCol w:w="6550"/>
       </w:tblGrid>
       <w:tr>
-        <w:tblPrEx>
-          <w:tblCellMar>
-            <w:top w:w="0" w:type="dxa"/>
-            <w:bottom w:w="0" w:type="dxa"/>
-          </w:tblCellMar>
-        </w:tblPrEx>
         <w:tc>
           <w:tcPr>
             <w:tcW w:w="2800" w:type="dxa"/>
@@ -129,12 +145,6 @@
         </w:tc>
       </w:tr>
       <w:tr>
-        <w:tblPrEx>
-          <w:tblCellMar>
-            <w:top w:w="0" w:type="dxa"/>
-            <w:bottom w:w="0" w:type="dxa"/>
-          </w:tblCellMar>
-        </w:tblPrEx>
         <w:tc>
           <w:tcPr>
             <w:tcW w:w="2800" w:type="dxa"/>
@@ -176,12 +186,6 @@
         </w:tc>
       </w:tr>
       <w:tr>
-        <w:tblPrEx>
-          <w:tblCellMar>
-            <w:top w:w="0" w:type="dxa"/>
-            <w:bottom w:w="0" w:type="dxa"/>
-          </w:tblCellMar>
-        </w:tblPrEx>
         <w:tc>
           <w:tcPr>
             <w:tcW w:w="2800" w:type="dxa"/>
@@ -217,30 +221,12 @@
           </w:tcPr>
           <w:p>
             <w:r>
-              <w:t>Sanjai M S</w:t>
-            </w:r>
-            <w:r>
-              <w:t xml:space="preserve"> | </w:t>
-            </w:r>
-            <w:r>
-              <w:t>sanjaims103@gmail.com</w:t>
-            </w:r>
-            <w:r>
-              <w:t xml:space="preserve"> | </w:t>
-            </w:r>
-            <w:r>
-              <w:t>9342672711</w:t>
+              <w:t>Sanjai M S | sanjaims103@gmail.com | 9342672711</w:t>
             </w:r>
           </w:p>
         </w:tc>
       </w:tr>
       <w:tr>
-        <w:tblPrEx>
-          <w:tblCellMar>
-            <w:top w:w="0" w:type="dxa"/>
-            <w:bottom w:w="0" w:type="dxa"/>
-          </w:tblCellMar>
-        </w:tblPrEx>
         <w:tc>
           <w:tcPr>
             <w:tcW w:w="2800" w:type="dxa"/>
@@ -282,12 +268,6 @@
         </w:tc>
       </w:tr>
       <w:tr>
-        <w:tblPrEx>
-          <w:tblCellMar>
-            <w:top w:w="0" w:type="dxa"/>
-            <w:bottom w:w="0" w:type="dxa"/>
-          </w:tblCellMar>
-        </w:tblPrEx>
         <w:tc>
           <w:tcPr>
             <w:tcW w:w="2800" w:type="dxa"/>
@@ -338,12 +318,6 @@
         </w:tc>
       </w:tr>
       <w:tr>
-        <w:tblPrEx>
-          <w:tblCellMar>
-            <w:top w:w="0" w:type="dxa"/>
-            <w:bottom w:w="0" w:type="dxa"/>
-          </w:tblCellMar>
-        </w:tblPrEx>
         <w:tc>
           <w:tcPr>
             <w:tcW w:w="2800" w:type="dxa"/>
@@ -440,12 +414,6 @@
         <w:gridCol w:w="9350"/>
       </w:tblGrid>
       <w:tr>
-        <w:tblPrEx>
-          <w:tblCellMar>
-            <w:top w:w="0" w:type="dxa"/>
-            <w:bottom w:w="0" w:type="dxa"/>
-          </w:tblCellMar>
-        </w:tblPrEx>
         <w:tc>
           <w:tcPr>
             <w:tcW w:w="9350" w:type="dxa"/>
@@ -468,7 +436,62 @@
                 <w:sz w:val="24"/>
                 <w:szCs w:val="24"/>
               </w:rPr>
-              <w:t>This self-hosted hybrid engine routes queries between ChromaDB for unstructured documents and SQLite for structured academic records. Role-based access control secures data access while a local Qwen2.5 model via Ollama synthesizes precise natural language answers. Integrated dual-way voice interaction and dynamic concept mapping enhance campus accessibility. The fully offline deployment guarantees total data privacy, zero internet dependency, and zero hallucinations on structured data.</w:t>
+              <w:t xml:space="preserve">This self-hosted hybrid engine routes queries between </w:t>
+            </w:r>
+            <w:proofErr w:type="spellStart"/>
+            <w:r>
+              <w:rPr>
+                <w:sz w:val="24"/>
+                <w:szCs w:val="24"/>
+              </w:rPr>
+              <w:t>ChromaDB</w:t>
+            </w:r>
+            <w:proofErr w:type="spellEnd"/>
+            <w:r>
+              <w:rPr>
+                <w:sz w:val="24"/>
+                <w:szCs w:val="24"/>
+              </w:rPr>
+              <w:t xml:space="preserve"> for unstructured documents and SQLite for structured academic records. Role-based access control secures data access while a local Qwen2.5 model via </w:t>
+            </w:r>
+            <w:proofErr w:type="spellStart"/>
+            <w:r>
+              <w:rPr>
+                <w:sz w:val="24"/>
+                <w:szCs w:val="24"/>
+              </w:rPr>
+              <w:t>Ollama</w:t>
+            </w:r>
+            <w:proofErr w:type="spellEnd"/>
+            <w:r>
+              <w:rPr>
+                <w:sz w:val="24"/>
+                <w:szCs w:val="24"/>
+              </w:rPr>
+              <w:t xml:space="preserve"> synthesizes precise natural language answers. Integrated dual-way voice interaction and dynamic concept mapping enhance campus accessibility. The fully offline deployment guarantees total data privacy, zero internet dependency, and zero hallucinations on structured data.</w:t>
+            </w:r>
+          </w:p>
+          <w:p>
+            <w:pPr>
+              <w:rPr>
+                <w:sz w:val="24"/>
+                <w:szCs w:val="24"/>
+              </w:rPr>
+            </w:pPr>
+          </w:p>
+          <w:p>
+            <w:pPr>
+              <w:rPr>
+                <w:sz w:val="24"/>
+                <w:szCs w:val="24"/>
+              </w:rPr>
+            </w:pPr>
+            <w:r>
+              <w:rPr>
+                <w:sz w:val="24"/>
+                <w:szCs w:val="24"/>
+              </w:rPr>
+              <w:t>To guarantee complete data reliability and mitigate the risks of AI hallucination, the system incorporates an "Enterprise Trust Layer." This layer operates 100% offline, intercepting the LLM's draft answer and mathematically verifying its factual accuracy against the local database using Natural Language Inference (NLI) models, ensuring end-users receive verified and trustworthy responses.</w:t>
             </w:r>
           </w:p>
         </w:tc>
@@ -532,18 +555,7 @@
           <w:sz w:val="24"/>
           <w:szCs w:val="24"/>
         </w:rPr>
-        <w:t>2.1 Architecture</w:t>
-      </w:r>
-      <w:r>
-        <w:rPr>
-          <w:rFonts w:ascii="Cambria" w:eastAsia="Cambria" w:hAnsi="Cambria" w:cs="Cambria"/>
-          <w:b/>
-          <w:bCs/>
-          <w:color w:val="16212B"/>
-          <w:sz w:val="24"/>
-          <w:szCs w:val="24"/>
-        </w:rPr>
-        <w:t xml:space="preserve"> Diagram</w:t>
+        <w:t>2.1 Architecture Diagram</w:t>
       </w:r>
     </w:p>
     <w:p>
@@ -553,30 +565,21 @@
       </w:pPr>
       <w:r>
         <w:rPr>
-          <w:rFonts w:ascii="Calibri" w:eastAsia="Calibri" w:hAnsi="Calibri" w:cs="Calibri"/>
-          <w:i/>
-          <w:iCs/>
-          <w:color w:val="6B7785"/>
-          <w:sz w:val="22"/>
-          <w:szCs w:val="22"/>
-        </w:rPr>
-        <w:t>.</w:t>
-      </w:r>
-      <w:r>
-        <w:rPr>
           <w:noProof/>
         </w:rPr>
-        <w:t xml:space="preserve"> </w:t>
-      </w:r>
-      <w:r>
-        <w:rPr>
-          <w:noProof/>
-        </w:rPr>
         <w:drawing>
-          <wp:inline distT="0" distB="0" distL="0" distR="0" wp14:anchorId="74D3CF7D" wp14:editId="5EA96663">
-            <wp:extent cx="5753100" cy="3819284"/>
-            <wp:effectExtent l="0" t="0" r="0" b="0"/>
-            <wp:docPr id="1" name="Picture 1"/>
+          <wp:anchor distT="0" distB="0" distL="114300" distR="114300" simplePos="0" relativeHeight="251658240" behindDoc="0" locked="0" layoutInCell="1" allowOverlap="1" wp14:anchorId="16ACD682" wp14:editId="3F98D1B0">
+            <wp:simplePos x="0" y="0"/>
+            <wp:positionH relativeFrom="margin">
+              <wp:posOffset>353786</wp:posOffset>
+            </wp:positionH>
+            <wp:positionV relativeFrom="paragraph">
+              <wp:posOffset>251097</wp:posOffset>
+            </wp:positionV>
+            <wp:extent cx="5763986" cy="3675099"/>
+            <wp:effectExtent l="0" t="0" r="8255" b="1905"/>
+            <wp:wrapNone/>
+            <wp:docPr id="1180461114" name="Picture 1"/>
             <wp:cNvGraphicFramePr>
               <a:graphicFrameLocks xmlns:a="http://schemas.openxmlformats.org/drawingml/2006/main" noChangeAspect="1"/>
             </wp:cNvGraphicFramePr>
@@ -584,11 +587,17 @@
               <a:graphicData uri="http://schemas.openxmlformats.org/drawingml/2006/picture">
                 <pic:pic xmlns:pic="http://schemas.openxmlformats.org/drawingml/2006/picture">
                   <pic:nvPicPr>
-                    <pic:cNvPr id="0" name="architecture_diagram.png"/>
+                    <pic:cNvPr id="1180461114" name=""/>
                     <pic:cNvPicPr/>
                   </pic:nvPicPr>
                   <pic:blipFill>
-                    <a:blip r:embed="rId7"/>
+                    <a:blip r:embed="rId7">
+                      <a:extLst>
+                        <a:ext uri="{28A0092B-C50C-407E-A947-70E740481C1C}">
+                          <a14:useLocalDpi xmlns:a14="http://schemas.microsoft.com/office/drawing/2010/main" val="0"/>
+                        </a:ext>
+                      </a:extLst>
+                    </a:blip>
                     <a:stretch>
                       <a:fillRect/>
                     </a:stretch>
@@ -596,7 +605,7 @@
                   <pic:spPr>
                     <a:xfrm>
                       <a:off x="0" y="0"/>
-                      <a:ext cx="5759650" cy="3823632"/>
+                      <a:ext cx="5763986" cy="3675099"/>
                     </a:xfrm>
                     <a:prstGeom prst="rect">
                       <a:avLst/>
@@ -605,8 +614,31 @@
                 </pic:pic>
               </a:graphicData>
             </a:graphic>
-          </wp:inline>
+            <wp14:sizeRelH relativeFrom="margin">
+              <wp14:pctWidth>0</wp14:pctWidth>
+            </wp14:sizeRelH>
+            <wp14:sizeRelV relativeFrom="margin">
+              <wp14:pctHeight>0</wp14:pctHeight>
+            </wp14:sizeRelV>
+          </wp:anchor>
         </w:drawing>
+      </w:r>
+      <w:r>
+        <w:rPr>
+          <w:rFonts w:ascii="Calibri" w:eastAsia="Calibri" w:hAnsi="Calibri" w:cs="Calibri"/>
+          <w:i/>
+          <w:iCs/>
+          <w:color w:val="6B7785"/>
+          <w:sz w:val="22"/>
+          <w:szCs w:val="22"/>
+        </w:rPr>
+        <w:t>.</w:t>
+      </w:r>
+      <w:r>
+        <w:rPr>
+          <w:noProof/>
+        </w:rPr>
+        <w:t xml:space="preserve"> </w:t>
       </w:r>
     </w:p>
     <w:p>
@@ -655,8 +687,6 @@
       <w:pPr>
         <w:pStyle w:val="Heading2"/>
         <w:spacing w:before="240" w:after="100"/>
-      </w:pPr>
-      <w:r>
         <w:rPr>
           <w:rFonts w:ascii="Cambria" w:eastAsia="Cambria" w:hAnsi="Cambria" w:cs="Cambria"/>
           <w:b/>
@@ -665,10 +695,12 @@
           <w:sz w:val="24"/>
           <w:szCs w:val="24"/>
         </w:rPr>
-        <w:lastRenderedPageBreak/>
-        <w:t>2.2 Architecture</w:t>
-      </w:r>
-      <w:r>
+      </w:pPr>
+    </w:p>
+    <w:p>
+      <w:pPr>
+        <w:pStyle w:val="Heading2"/>
+        <w:spacing w:before="240" w:after="100"/>
         <w:rPr>
           <w:rFonts w:ascii="Cambria" w:eastAsia="Cambria" w:hAnsi="Cambria" w:cs="Cambria"/>
           <w:b/>
@@ -677,7 +709,108 @@
           <w:sz w:val="24"/>
           <w:szCs w:val="24"/>
         </w:rPr>
-        <w:t xml:space="preserve"> Narrative</w:t>
+      </w:pPr>
+    </w:p>
+    <w:p>
+      <w:pPr>
+        <w:pStyle w:val="Heading2"/>
+        <w:spacing w:before="240" w:after="100"/>
+        <w:rPr>
+          <w:rFonts w:ascii="Cambria" w:eastAsia="Cambria" w:hAnsi="Cambria" w:cs="Cambria"/>
+          <w:b/>
+          <w:bCs/>
+          <w:color w:val="16212B"/>
+          <w:sz w:val="24"/>
+          <w:szCs w:val="24"/>
+        </w:rPr>
+      </w:pPr>
+    </w:p>
+    <w:p>
+      <w:pPr>
+        <w:pStyle w:val="Heading2"/>
+        <w:spacing w:before="240" w:after="100"/>
+        <w:rPr>
+          <w:rFonts w:ascii="Cambria" w:eastAsia="Cambria" w:hAnsi="Cambria" w:cs="Cambria"/>
+          <w:b/>
+          <w:bCs/>
+          <w:color w:val="16212B"/>
+          <w:sz w:val="24"/>
+          <w:szCs w:val="24"/>
+        </w:rPr>
+      </w:pPr>
+    </w:p>
+    <w:p>
+      <w:pPr>
+        <w:pStyle w:val="Heading2"/>
+        <w:spacing w:before="240" w:after="100"/>
+        <w:rPr>
+          <w:rFonts w:ascii="Cambria" w:eastAsia="Cambria" w:hAnsi="Cambria" w:cs="Cambria"/>
+          <w:b/>
+          <w:bCs/>
+          <w:color w:val="16212B"/>
+          <w:sz w:val="24"/>
+          <w:szCs w:val="24"/>
+        </w:rPr>
+      </w:pPr>
+    </w:p>
+    <w:p>
+      <w:pPr>
+        <w:pStyle w:val="Heading2"/>
+        <w:spacing w:before="240" w:after="100"/>
+        <w:rPr>
+          <w:rFonts w:ascii="Cambria" w:eastAsia="Cambria" w:hAnsi="Cambria" w:cs="Cambria"/>
+          <w:b/>
+          <w:bCs/>
+          <w:color w:val="16212B"/>
+          <w:sz w:val="24"/>
+          <w:szCs w:val="24"/>
+        </w:rPr>
+      </w:pPr>
+    </w:p>
+    <w:p>
+      <w:pPr>
+        <w:pStyle w:val="Heading2"/>
+        <w:spacing w:before="240" w:after="100"/>
+        <w:rPr>
+          <w:rFonts w:ascii="Cambria" w:eastAsia="Cambria" w:hAnsi="Cambria" w:cs="Cambria"/>
+          <w:b/>
+          <w:bCs/>
+          <w:color w:val="16212B"/>
+          <w:sz w:val="24"/>
+          <w:szCs w:val="24"/>
+        </w:rPr>
+      </w:pPr>
+    </w:p>
+    <w:p>
+      <w:pPr>
+        <w:pStyle w:val="Heading2"/>
+        <w:spacing w:before="240" w:after="100"/>
+        <w:rPr>
+          <w:rFonts w:ascii="Cambria" w:eastAsia="Cambria" w:hAnsi="Cambria" w:cs="Cambria"/>
+          <w:b/>
+          <w:bCs/>
+          <w:color w:val="16212B"/>
+          <w:sz w:val="24"/>
+          <w:szCs w:val="24"/>
+        </w:rPr>
+      </w:pPr>
+    </w:p>
+    <w:p>
+      <w:pPr>
+        <w:pStyle w:val="Heading2"/>
+        <w:spacing w:before="240" w:after="100"/>
+      </w:pPr>
+      <w:r>
+        <w:rPr>
+          <w:rFonts w:ascii="Cambria" w:eastAsia="Cambria" w:hAnsi="Cambria" w:cs="Cambria"/>
+          <w:b/>
+          <w:bCs/>
+          <w:color w:val="16212B"/>
+          <w:sz w:val="24"/>
+          <w:szCs w:val="24"/>
+        </w:rPr>
+        <w:lastRenderedPageBreak/>
+        <w:t>2.2 Architecture Narrative</w:t>
       </w:r>
     </w:p>
     <w:tbl>
@@ -701,12 +834,6 @@
         <w:gridCol w:w="9350"/>
       </w:tblGrid>
       <w:tr>
-        <w:tblPrEx>
-          <w:tblCellMar>
-            <w:top w:w="0" w:type="dxa"/>
-            <w:bottom w:w="0" w:type="dxa"/>
-          </w:tblCellMar>
-        </w:tblPrEx>
         <w:tc>
           <w:tcPr>
             <w:tcW w:w="9350" w:type="dxa"/>
@@ -729,20 +856,36 @@
                 <w:sz w:val="24"/>
                 <w:szCs w:val="24"/>
               </w:rPr>
-              <w:t>1. User Interaction &amp; RBAC Authentication: A student or staff member submits a query via the Streamlit web dashboard or voice agent. The security layer validates user credentials and assigns role-based data visibility scopes.</w:t>
-            </w:r>
+              <w:t xml:space="preserve">1. User Interaction &amp; RBAC Authentication: A student or staff member submits a query via the </w:t>
+            </w:r>
+            <w:proofErr w:type="spellStart"/>
             <w:r>
               <w:rPr>
                 <w:sz w:val="24"/>
                 <w:szCs w:val="24"/>
               </w:rPr>
-              <w:br/>
-            </w:r>
+              <w:t>Streamlit</w:t>
+            </w:r>
+            <w:proofErr w:type="spellEnd"/>
             <w:r>
               <w:rPr>
                 <w:sz w:val="24"/>
                 <w:szCs w:val="24"/>
               </w:rPr>
+              <w:t xml:space="preserve"> web dashboard or voice agent. The security layer validates user credentials and assigns role-based data visibility scopes.</w:t>
+            </w:r>
+            <w:r>
+              <w:rPr>
+                <w:sz w:val="24"/>
+                <w:szCs w:val="24"/>
+              </w:rPr>
+              <w:br/>
+            </w:r>
+            <w:r>
+              <w:rPr>
+                <w:sz w:val="24"/>
+                <w:szCs w:val="24"/>
+              </w:rPr>
               <w:br/>
               <w:t>2. Query Ingestion &amp; Intent Routing: The query router evaluates the request intent to classify it into a structured query (grades/attendance/schedules), unstructured query (policies/course FAQs), or historical query lookup.</w:t>
             </w:r>
@@ -775,13 +918,29 @@
                 <w:szCs w:val="24"/>
               </w:rPr>
               <w:br/>
-              <w:t xml:space="preserve">   • Unstructured Path: Generates a 1024-dimensional dense vector embedding via BAAI/bge-large-en-v1.5 and performs metadata-filtered similarity search in ChromaDB to retrieve top-K relevant text passages.</w:t>
-            </w:r>
+              <w:t xml:space="preserve">   • Unstructured Path: Generates a 1024-dimensional dense vector embedding via BAAI/bge-large-en-v1.5 and performs metadata-filtered similarity search in </w:t>
+            </w:r>
+            <w:proofErr w:type="spellStart"/>
             <w:r>
               <w:rPr>
                 <w:sz w:val="24"/>
                 <w:szCs w:val="24"/>
               </w:rPr>
+              <w:t>ChromaDB</w:t>
+            </w:r>
+            <w:proofErr w:type="spellEnd"/>
+            <w:r>
+              <w:rPr>
+                <w:sz w:val="24"/>
+                <w:szCs w:val="24"/>
+              </w:rPr>
+              <w:t xml:space="preserve"> to retrieve top-K relevant text passages.</w:t>
+            </w:r>
+            <w:r>
+              <w:rPr>
+                <w:sz w:val="24"/>
+                <w:szCs w:val="24"/>
+              </w:rPr>
               <w:br/>
               <w:t xml:space="preserve">   • Historical Path: Performs semantic similarity search against previously logged student queries in chats.py to enable instant cached responses.</w:t>
             </w:r>
@@ -813,24 +972,102 @@
                 <w:szCs w:val="24"/>
               </w:rPr>
               <w:br/>
-              <w:t>5. Local LLM Answer Generation: The prompt is dispatched to a locally hosted LLM (via Ollama API). The model generates a grounded, accurate natural language response complete with document source citations.</w:t>
-            </w:r>
+              <w:t xml:space="preserve">5. Local LLM Answer Generation: The prompt is dispatched to a locally hosted LLM (via </w:t>
+            </w:r>
+            <w:proofErr w:type="spellStart"/>
             <w:r>
               <w:rPr>
                 <w:sz w:val="24"/>
                 <w:szCs w:val="24"/>
               </w:rPr>
-              <w:br/>
-            </w:r>
+              <w:t>Ollama</w:t>
+            </w:r>
+            <w:proofErr w:type="spellEnd"/>
             <w:r>
               <w:rPr>
                 <w:sz w:val="24"/>
                 <w:szCs w:val="24"/>
               </w:rPr>
+              <w:t xml:space="preserve"> API). The model generates a grounded, accurate natural language response complete with document source citations.</w:t>
+            </w:r>
+            <w:r>
+              <w:rPr>
+                <w:sz w:val="24"/>
+                <w:szCs w:val="24"/>
+              </w:rPr>
+              <w:br/>
+            </w:r>
+            <w:r>
+              <w:rPr>
+                <w:sz w:val="24"/>
+                <w:szCs w:val="24"/>
+              </w:rPr>
               <w:br/>
               <w:t>6. Response Delivery &amp; Audit Logging: The UI renders formatted Markdown text, interactive data tables, source badges, and synthesizes audio via TTS if voice mode is active. The request, response, and performance metrics are logged into database for continuous system auditing.</w:t>
             </w:r>
           </w:p>
+          <w:p>
+            <w:pPr>
+              <w:rPr>
+                <w:sz w:val="24"/>
+                <w:szCs w:val="24"/>
+              </w:rPr>
+            </w:pPr>
+          </w:p>
+          <w:p>
+            <w:pPr>
+              <w:rPr>
+                <w:sz w:val="24"/>
+                <w:szCs w:val="24"/>
+              </w:rPr>
+            </w:pPr>
+            <w:r>
+              <w:rPr>
+                <w:sz w:val="24"/>
+                <w:szCs w:val="24"/>
+              </w:rPr>
+              <w:t xml:space="preserve">7. </w:t>
+            </w:r>
+            <w:r>
+              <w:rPr>
+                <w:sz w:val="24"/>
+                <w:szCs w:val="24"/>
+              </w:rPr>
+              <w:t>Offline Fact-Checking &amp; Delivery Phase: Before delivering the final response, the Qwen2.5 LLM's draft answer is routed to the Trust Layer. Here, a local NLP parser (NLTK/</w:t>
+            </w:r>
+            <w:proofErr w:type="spellStart"/>
+            <w:r>
+              <w:rPr>
+                <w:sz w:val="24"/>
+                <w:szCs w:val="24"/>
+              </w:rPr>
+              <w:t>SpaCy</w:t>
+            </w:r>
+            <w:proofErr w:type="spellEnd"/>
+            <w:r>
+              <w:rPr>
+                <w:sz w:val="24"/>
+                <w:szCs w:val="24"/>
+              </w:rPr>
+              <w:t xml:space="preserve">) extracts atomic claims from the text. These claims, along with the original context retrieved from </w:t>
+            </w:r>
+            <w:proofErr w:type="spellStart"/>
+            <w:r>
+              <w:rPr>
+                <w:sz w:val="24"/>
+                <w:szCs w:val="24"/>
+              </w:rPr>
+              <w:t>ChromaDB</w:t>
+            </w:r>
+            <w:proofErr w:type="spellEnd"/>
+            <w:r>
+              <w:rPr>
+                <w:sz w:val="24"/>
+                <w:szCs w:val="24"/>
+              </w:rPr>
+              <w:t>/SQLite, are processed by a localized Cross-Encoder NLI model. The model classifies each claim as entailed or contradicted, generating an aggregate Reliability Score. Responses falling below a configured confidence threshold trigger an automated fallback protocol, ensuring hallucinations are caught before reaching the user interface.</w:t>
+            </w:r>
+          </w:p>
         </w:tc>
       </w:tr>
     </w:tbl>
@@ -838,8 +1075,6 @@
       <w:pPr>
         <w:pStyle w:val="Heading1"/>
         <w:spacing w:before="400" w:after="160"/>
-      </w:pPr>
-      <w:r>
         <w:rPr>
           <w:rFonts w:ascii="Cambria" w:eastAsia="Cambria" w:hAnsi="Cambria" w:cs="Cambria"/>
           <w:b/>
@@ -848,6 +1083,23 @@
           <w:sz w:val="30"/>
           <w:szCs w:val="30"/>
         </w:rPr>
+      </w:pPr>
+    </w:p>
+    <w:p>
+      <w:pPr>
+        <w:pStyle w:val="Heading1"/>
+        <w:spacing w:before="400" w:after="160"/>
+      </w:pPr>
+      <w:r>
+        <w:rPr>
+          <w:rFonts w:ascii="Cambria" w:eastAsia="Cambria" w:hAnsi="Cambria" w:cs="Cambria"/>
+          <w:b/>
+          <w:bCs/>
+          <w:color w:val="C97A1F"/>
+          <w:sz w:val="30"/>
+          <w:szCs w:val="30"/>
+        </w:rPr>
+        <w:lastRenderedPageBreak/>
         <w:t xml:space="preserve">3.  </w:t>
       </w:r>
       <w:r>
@@ -894,12 +1146,6 @@
         <w:gridCol w:w="2000"/>
       </w:tblGrid>
       <w:tr>
-        <w:tblPrEx>
-          <w:tblCellMar>
-            <w:top w:w="0" w:type="dxa"/>
-            <w:bottom w:w="0" w:type="dxa"/>
-          </w:tblCellMar>
-        </w:tblPrEx>
         <w:tc>
           <w:tcPr>
             <w:tcW w:w="1800" w:type="dxa"/>
@@ -994,12 +1240,6 @@
         </w:tc>
       </w:tr>
       <w:tr>
-        <w:tblPrEx>
-          <w:tblCellMar>
-            <w:top w:w="0" w:type="dxa"/>
-            <w:bottom w:w="0" w:type="dxa"/>
-          </w:tblCellMar>
-        </w:tblPrEx>
         <w:tc>
           <w:tcPr>
             <w:tcW w:w="1800" w:type="dxa"/>
@@ -1035,26 +1275,29 @@
             <w:tcW w:w="2000" w:type="dxa"/>
           </w:tcPr>
           <w:p>
-            <w:r>
-              <w:t>PyPDF, LangChain</w:t>
-            </w:r>
+            <w:proofErr w:type="spellStart"/>
+            <w:r>
+              <w:t>PyPDF</w:t>
+            </w:r>
+            <w:proofErr w:type="spellEnd"/>
+            <w:r>
+              <w:t xml:space="preserve">, </w:t>
+            </w:r>
+            <w:proofErr w:type="spellStart"/>
+            <w:r>
+              <w:t>LangChain</w:t>
+            </w:r>
+            <w:proofErr w:type="spellEnd"/>
           </w:p>
         </w:tc>
       </w:tr>
       <w:tr>
-        <w:tblPrEx>
-          <w:tblCellMar>
-            <w:top w:w="0" w:type="dxa"/>
-            <w:bottom w:w="0" w:type="dxa"/>
-          </w:tblCellMar>
-        </w:tblPrEx>
         <w:tc>
           <w:tcPr>
             <w:tcW w:w="1800" w:type="dxa"/>
           </w:tcPr>
           <w:p>
             <w:r>
-              <w:lastRenderedPageBreak/>
               <w:t>Vector Index &amp; Storage Engine</w:t>
             </w:r>
           </w:p>
@@ -1065,7 +1308,15 @@
           </w:tcPr>
           <w:p>
             <w:r>
-              <w:t>Generates dense embeddings using BAAI/bge-large-en-v1.5 and manages persistent ChromaDB collections with metadata filters.</w:t>
+              <w:t xml:space="preserve">Generates dense embeddings using BAAI/bge-large-en-v1.5 and manages persistent </w:t>
+            </w:r>
+            <w:proofErr w:type="spellStart"/>
+            <w:r>
+              <w:t>ChromaDB</w:t>
+            </w:r>
+            <w:proofErr w:type="spellEnd"/>
+            <w:r>
+              <w:t xml:space="preserve"> collections with metadata filters.</w:t>
             </w:r>
           </w:p>
         </w:tc>
@@ -1085,18 +1336,17 @@
           </w:tcPr>
           <w:p>
             <w:r>
-              <w:t>Sentence-Transformers, ChromaDB</w:t>
-            </w:r>
+              <w:t xml:space="preserve">Sentence-Transformers, </w:t>
+            </w:r>
+            <w:proofErr w:type="spellStart"/>
+            <w:r>
+              <w:t>ChromaDB</w:t>
+            </w:r>
+            <w:proofErr w:type="spellEnd"/>
           </w:p>
         </w:tc>
       </w:tr>
       <w:tr>
-        <w:tblPrEx>
-          <w:tblCellMar>
-            <w:top w:w="0" w:type="dxa"/>
-            <w:bottom w:w="0" w:type="dxa"/>
-          </w:tblCellMar>
-        </w:tblPrEx>
         <w:tc>
           <w:tcPr>
             <w:tcW w:w="1800" w:type="dxa"/>
@@ -1139,12 +1389,6 @@
         </w:tc>
       </w:tr>
       <w:tr>
-        <w:tblPrEx>
-          <w:tblCellMar>
-            <w:top w:w="0" w:type="dxa"/>
-            <w:bottom w:w="0" w:type="dxa"/>
-          </w:tblCellMar>
-        </w:tblPrEx>
         <w:tc>
           <w:tcPr>
             <w:tcW w:w="1800" w:type="dxa"/>
@@ -1181,18 +1425,17 @@
           </w:tcPr>
           <w:p>
             <w:r>
-              <w:t>SQLite3, ChromaDB</w:t>
-            </w:r>
+              <w:t xml:space="preserve">SQLite3, </w:t>
+            </w:r>
+            <w:proofErr w:type="spellStart"/>
+            <w:r>
+              <w:t>ChromaDB</w:t>
+            </w:r>
+            <w:proofErr w:type="spellEnd"/>
           </w:p>
         </w:tc>
       </w:tr>
       <w:tr>
-        <w:tblPrEx>
-          <w:tblCellMar>
-            <w:top w:w="0" w:type="dxa"/>
-            <w:bottom w:w="0" w:type="dxa"/>
-          </w:tblCellMar>
-        </w:tblPrEx>
         <w:tc>
           <w:tcPr>
             <w:tcW w:w="1800" w:type="dxa"/>
@@ -1209,7 +1452,15 @@
           </w:tcPr>
           <w:p>
             <w:r>
-              <w:t>Constructs context-augmented prompts and interfaces with local Qwen2.5 LLM via Ollama for natural language answers.</w:t>
+              <w:t xml:space="preserve">Constructs context-augmented prompts and interfaces with local Qwen2.5 LLM via </w:t>
+            </w:r>
+            <w:proofErr w:type="spellStart"/>
+            <w:r>
+              <w:t>Ollama</w:t>
+            </w:r>
+            <w:proofErr w:type="spellEnd"/>
+            <w:r>
+              <w:t xml:space="preserve"> for natural language answers.</w:t>
             </w:r>
           </w:p>
         </w:tc>
@@ -1228,19 +1479,18 @@
             <w:tcW w:w="2000" w:type="dxa"/>
           </w:tcPr>
           <w:p>
-            <w:r>
-              <w:t>Ollama API, Qwen2.5 LLM</w:t>
+            <w:proofErr w:type="spellStart"/>
+            <w:r>
+              <w:t>Ollama</w:t>
+            </w:r>
+            <w:proofErr w:type="spellEnd"/>
+            <w:r>
+              <w:t xml:space="preserve"> API, Qwen2.5 LLM</w:t>
             </w:r>
           </w:p>
         </w:tc>
       </w:tr>
       <w:tr>
-        <w:tblPrEx>
-          <w:tblCellMar>
-            <w:top w:w="0" w:type="dxa"/>
-            <w:bottom w:w="0" w:type="dxa"/>
-          </w:tblCellMar>
-        </w:tblPrEx>
         <w:tc>
           <w:tcPr>
             <w:tcW w:w="1800" w:type="dxa"/>
@@ -1276,19 +1526,26 @@
             <w:tcW w:w="2000" w:type="dxa"/>
           </w:tcPr>
           <w:p>
-            <w:r>
-              <w:t>SpeechRecognition, gTTS/pyttsx3</w:t>
+            <w:proofErr w:type="spellStart"/>
+            <w:r>
+              <w:t>SpeechRecognition</w:t>
+            </w:r>
+            <w:proofErr w:type="spellEnd"/>
+            <w:r>
+              <w:t xml:space="preserve">, </w:t>
+            </w:r>
+            <w:proofErr w:type="spellStart"/>
+            <w:r>
+              <w:t>gTTS</w:t>
+            </w:r>
+            <w:proofErr w:type="spellEnd"/>
+            <w:r>
+              <w:t>/pyttsx3</w:t>
             </w:r>
           </w:p>
         </w:tc>
       </w:tr>
       <w:tr>
-        <w:tblPrEx>
-          <w:tblCellMar>
-            <w:top w:w="0" w:type="dxa"/>
-            <w:bottom w:w="0" w:type="dxa"/>
-          </w:tblCellMar>
-        </w:tblPrEx>
         <w:tc>
           <w:tcPr>
             <w:tcW w:w="1800" w:type="dxa"/>
@@ -1324,26 +1581,38 @@
             <w:tcW w:w="2000" w:type="dxa"/>
           </w:tcPr>
           <w:p>
-            <w:r>
-              <w:t>PyVis, Streamlit Components</w:t>
+            <w:proofErr w:type="spellStart"/>
+            <w:r>
+              <w:t>PyVis</w:t>
+            </w:r>
+            <w:proofErr w:type="spellEnd"/>
+            <w:r>
+              <w:t xml:space="preserve">, </w:t>
+            </w:r>
+            <w:proofErr w:type="spellStart"/>
+            <w:r>
+              <w:t>Streamlit</w:t>
+            </w:r>
+            <w:proofErr w:type="spellEnd"/>
+            <w:r>
+              <w:t xml:space="preserve"> Components</w:t>
             </w:r>
           </w:p>
         </w:tc>
       </w:tr>
       <w:tr>
-        <w:tblPrEx>
-          <w:tblCellMar>
-            <w:top w:w="0" w:type="dxa"/>
-            <w:bottom w:w="0" w:type="dxa"/>
-          </w:tblCellMar>
-        </w:tblPrEx>
         <w:tc>
           <w:tcPr>
             <w:tcW w:w="1800" w:type="dxa"/>
           </w:tcPr>
           <w:p>
-            <w:r>
-              <w:t>Streamlit Web UI &amp; Security Layer</w:t>
+            <w:proofErr w:type="spellStart"/>
+            <w:r>
+              <w:t>Streamlit</w:t>
+            </w:r>
+            <w:proofErr w:type="spellEnd"/>
+            <w:r>
+              <w:t xml:space="preserve"> Web UI &amp; Security Layer</w:t>
             </w:r>
           </w:p>
         </w:tc>
@@ -1353,7 +1622,15 @@
           </w:tcPr>
           <w:p>
             <w:r>
-              <w:t>Provides multi-page glassmorphic web portal, RBAC view isolation, document upload tools, and search lab.</w:t>
+              <w:t xml:space="preserve">Provides multi-page </w:t>
+            </w:r>
+            <w:proofErr w:type="spellStart"/>
+            <w:r>
+              <w:t>glassmorphic</w:t>
+            </w:r>
+            <w:proofErr w:type="spellEnd"/>
+            <w:r>
+              <w:t xml:space="preserve"> web portal, RBAC view isolation, document upload tools, and search lab.</w:t>
             </w:r>
           </w:p>
         </w:tc>
@@ -1372,8 +1649,114 @@
             <w:tcW w:w="2000" w:type="dxa"/>
           </w:tcPr>
           <w:p>
-            <w:r>
-              <w:t>Streamlit, Custom CSS</w:t>
+            <w:proofErr w:type="spellStart"/>
+            <w:r>
+              <w:t>Streamlit</w:t>
+            </w:r>
+            <w:proofErr w:type="spellEnd"/>
+            <w:r>
+              <w:t>, Custom CSS</w:t>
+            </w:r>
+          </w:p>
+        </w:tc>
+      </w:tr>
+      <w:tr>
+        <w:tc>
+          <w:tcPr>
+            <w:tcW w:w="1800" w:type="dxa"/>
+          </w:tcPr>
+          <w:p>
+            <w:r>
+              <w:t>Enterprise Trust Layer (Hallucination Detection)</w:t>
+            </w:r>
+          </w:p>
+        </w:tc>
+        <w:tc>
+          <w:tcPr>
+            <w:tcW w:w="2600" w:type="dxa"/>
+          </w:tcPr>
+          <w:p>
+            <w:r>
+              <w:t>Claim Extraction Engine</w:t>
+            </w:r>
+            <w:r>
+              <w:t xml:space="preserve">, </w:t>
+            </w:r>
+            <w:r>
+              <w:t>Context Verification Engine</w:t>
+            </w:r>
+            <w:r>
+              <w:t>,</w:t>
+            </w:r>
+          </w:p>
+          <w:p>
+            <w:r>
+              <w:t>Reliability Scoring Engine</w:t>
+            </w:r>
+          </w:p>
+        </w:tc>
+        <w:tc>
+          <w:tcPr>
+            <w:tcW w:w="2950" w:type="dxa"/>
+          </w:tcPr>
+          <w:p>
+            <w:r>
+              <w:t>S</w:t>
+            </w:r>
+            <w:r>
+              <w:t>plit the generated LLM response</w:t>
+            </w:r>
+            <w:r>
+              <w:t>.</w:t>
+            </w:r>
+          </w:p>
+          <w:p>
+            <w:r>
+              <w:t>C</w:t>
+            </w:r>
+            <w:r>
+              <w:t xml:space="preserve">ompares extracted claims directly against the retrieved </w:t>
+            </w:r>
+            <w:r>
+              <w:t>text. F</w:t>
+            </w:r>
+            <w:r>
+              <w:t>inal confidence score</w:t>
+            </w:r>
+            <w:r>
+              <w:t xml:space="preserve"> (0-100%)</w:t>
+            </w:r>
+          </w:p>
+        </w:tc>
+        <w:tc>
+          <w:tcPr>
+            <w:tcW w:w="2000" w:type="dxa"/>
+          </w:tcPr>
+          <w:p>
+            <w:r>
+              <w:t xml:space="preserve">NLTK or </w:t>
+            </w:r>
+            <w:proofErr w:type="spellStart"/>
+            <w:r>
+              <w:t>SpaCy</w:t>
+            </w:r>
+            <w:proofErr w:type="spellEnd"/>
+            <w:r>
+              <w:t>,</w:t>
+            </w:r>
+          </w:p>
+          <w:p>
+            <w:r>
+              <w:t>sentence-transformers</w:t>
+            </w:r>
+            <w:r>
+              <w:t xml:space="preserve">, Python </w:t>
+            </w:r>
+            <w:r>
+              <w:t>NLI classifications</w:t>
+            </w:r>
+            <w:r>
+              <w:t>.</w:t>
             </w:r>
           </w:p>
         </w:tc>
@@ -1383,8 +1766,6 @@
       <w:pPr>
         <w:pStyle w:val="Heading1"/>
         <w:spacing w:before="400" w:after="160"/>
-      </w:pPr>
-      <w:r>
         <w:rPr>
           <w:rFonts w:ascii="Cambria" w:eastAsia="Cambria" w:hAnsi="Cambria" w:cs="Cambria"/>
           <w:b/>
@@ -1393,6 +1774,65 @@
           <w:sz w:val="30"/>
           <w:szCs w:val="30"/>
         </w:rPr>
+      </w:pPr>
+    </w:p>
+    <w:p>
+      <w:pPr>
+        <w:pStyle w:val="Heading1"/>
+        <w:spacing w:before="400" w:after="160"/>
+        <w:rPr>
+          <w:rFonts w:ascii="Cambria" w:eastAsia="Cambria" w:hAnsi="Cambria" w:cs="Cambria"/>
+          <w:b/>
+          <w:bCs/>
+          <w:color w:val="C97A1F"/>
+          <w:sz w:val="30"/>
+          <w:szCs w:val="30"/>
+        </w:rPr>
+      </w:pPr>
+    </w:p>
+    <w:p>
+      <w:pPr>
+        <w:pStyle w:val="Heading1"/>
+        <w:spacing w:before="400" w:after="160"/>
+        <w:rPr>
+          <w:rFonts w:ascii="Cambria" w:eastAsia="Cambria" w:hAnsi="Cambria" w:cs="Cambria"/>
+          <w:b/>
+          <w:bCs/>
+          <w:color w:val="C97A1F"/>
+          <w:sz w:val="30"/>
+          <w:szCs w:val="30"/>
+        </w:rPr>
+      </w:pPr>
+    </w:p>
+    <w:p>
+      <w:pPr>
+        <w:pStyle w:val="Heading1"/>
+        <w:spacing w:before="400" w:after="160"/>
+        <w:rPr>
+          <w:rFonts w:ascii="Cambria" w:eastAsia="Cambria" w:hAnsi="Cambria" w:cs="Cambria"/>
+          <w:b/>
+          <w:bCs/>
+          <w:color w:val="C97A1F"/>
+          <w:sz w:val="30"/>
+          <w:szCs w:val="30"/>
+        </w:rPr>
+      </w:pPr>
+    </w:p>
+    <w:p>
+      <w:pPr>
+        <w:pStyle w:val="Heading1"/>
+        <w:spacing w:before="400" w:after="160"/>
+      </w:pPr>
+      <w:r>
+        <w:rPr>
+          <w:rFonts w:ascii="Cambria" w:eastAsia="Cambria" w:hAnsi="Cambria" w:cs="Cambria"/>
+          <w:b/>
+          <w:bCs/>
+          <w:color w:val="C97A1F"/>
+          <w:sz w:val="30"/>
+          <w:szCs w:val="30"/>
+        </w:rPr>
+        <w:lastRenderedPageBreak/>
         <w:t xml:space="preserve">4.  </w:t>
       </w:r>
       <w:r>
@@ -1438,12 +1878,6 @@
         <w:gridCol w:w="4350"/>
       </w:tblGrid>
       <w:tr>
-        <w:tblPrEx>
-          <w:tblCellMar>
-            <w:top w:w="0" w:type="dxa"/>
-            <w:bottom w:w="0" w:type="dxa"/>
-          </w:tblCellMar>
-        </w:tblPrEx>
         <w:tc>
           <w:tcPr>
             <w:tcW w:w="2000" w:type="dxa"/>
@@ -1515,12 +1949,6 @@
         </w:tc>
       </w:tr>
       <w:tr>
-        <w:tblPrEx>
-          <w:tblCellMar>
-            <w:top w:w="0" w:type="dxa"/>
-            <w:bottom w:w="0" w:type="dxa"/>
-          </w:tblCellMar>
-        </w:tblPrEx>
         <w:tc>
           <w:tcPr>
             <w:tcW w:w="2000" w:type="dxa"/>
@@ -1536,8 +1964,13 @@
             <w:tcW w:w="3000" w:type="dxa"/>
           </w:tcPr>
           <w:p>
-            <w:r>
-              <w:t>Streamlit + CSS (assets/styles.css)</w:t>
+            <w:proofErr w:type="spellStart"/>
+            <w:r>
+              <w:t>Streamlit</w:t>
+            </w:r>
+            <w:proofErr w:type="spellEnd"/>
+            <w:r>
+              <w:t xml:space="preserve"> + CSS (assets/styles.css)</w:t>
             </w:r>
           </w:p>
         </w:tc>
@@ -1547,18 +1980,20 @@
           </w:tcPr>
           <w:p>
             <w:r>
-              <w:t>Delivers an intuitive, responsive multi-page web dashboard with interactive tables, voice controls, and glassmorphic aesthetics without web server complexity.</w:t>
+              <w:t xml:space="preserve">Delivers an intuitive, responsive multi-page web dashboard with interactive tables, voice controls, and </w:t>
+            </w:r>
+            <w:proofErr w:type="spellStart"/>
+            <w:r>
+              <w:t>glassmorphic</w:t>
+            </w:r>
+            <w:proofErr w:type="spellEnd"/>
+            <w:r>
+              <w:t xml:space="preserve"> aesthetics without web server complexity.</w:t>
             </w:r>
           </w:p>
         </w:tc>
       </w:tr>
       <w:tr>
-        <w:tblPrEx>
-          <w:tblCellMar>
-            <w:top w:w="0" w:type="dxa"/>
-            <w:bottom w:w="0" w:type="dxa"/>
-          </w:tblCellMar>
-        </w:tblPrEx>
         <w:tc>
           <w:tcPr>
             <w:tcW w:w="2000" w:type="dxa"/>
@@ -1575,7 +2010,15 @@
           </w:tcPr>
           <w:p>
             <w:r>
-              <w:t>Python 3.10 + Flask / Streamlit Engine</w:t>
+              <w:t xml:space="preserve">Python 3.10 + Flask / </w:t>
+            </w:r>
+            <w:proofErr w:type="spellStart"/>
+            <w:r>
+              <w:t>Streamlit</w:t>
+            </w:r>
+            <w:proofErr w:type="spellEnd"/>
+            <w:r>
+              <w:t xml:space="preserve"> Engine</w:t>
             </w:r>
           </w:p>
         </w:tc>
@@ -1591,12 +2034,6 @@
         </w:tc>
       </w:tr>
       <w:tr>
-        <w:tblPrEx>
-          <w:tblCellMar>
-            <w:top w:w="0" w:type="dxa"/>
-            <w:bottom w:w="0" w:type="dxa"/>
-          </w:tblCellMar>
-        </w:tblPrEx>
         <w:tc>
           <w:tcPr>
             <w:tcW w:w="2000" w:type="dxa"/>
@@ -1629,12 +2066,6 @@
         </w:tc>
       </w:tr>
       <w:tr>
-        <w:tblPrEx>
-          <w:tblCellMar>
-            <w:top w:w="0" w:type="dxa"/>
-            <w:bottom w:w="0" w:type="dxa"/>
-          </w:tblCellMar>
-        </w:tblPrEx>
         <w:tc>
           <w:tcPr>
             <w:tcW w:w="2000" w:type="dxa"/>
@@ -1651,7 +2082,15 @@
           </w:tcPr>
           <w:p>
             <w:r>
-              <w:t>Qwen2.5 (7B/14B Quantized via Ollama API)</w:t>
+              <w:t xml:space="preserve">Qwen2.5 (7B/14B Quantized via </w:t>
+            </w:r>
+            <w:proofErr w:type="spellStart"/>
+            <w:r>
+              <w:t>Ollama</w:t>
+            </w:r>
+            <w:proofErr w:type="spellEnd"/>
+            <w:r>
+              <w:t xml:space="preserve"> API)</w:t>
             </w:r>
           </w:p>
         </w:tc>
@@ -1667,12 +2106,6 @@
         </w:tc>
       </w:tr>
       <w:tr>
-        <w:tblPrEx>
-          <w:tblCellMar>
-            <w:top w:w="0" w:type="dxa"/>
-            <w:bottom w:w="0" w:type="dxa"/>
-          </w:tblCellMar>
-        </w:tblPrEx>
         <w:tc>
           <w:tcPr>
             <w:tcW w:w="2000" w:type="dxa"/>
@@ -1688,8 +2121,13 @@
             <w:tcW w:w="3000" w:type="dxa"/>
           </w:tcPr>
           <w:p>
-            <w:r>
-              <w:t>ChromaDB (Local Persistent Vector Database)</w:t>
+            <w:proofErr w:type="spellStart"/>
+            <w:r>
+              <w:t>ChromaDB</w:t>
+            </w:r>
+            <w:proofErr w:type="spellEnd"/>
+            <w:r>
+              <w:t xml:space="preserve"> (Local Persistent Vector Database)</w:t>
             </w:r>
           </w:p>
         </w:tc>
@@ -1705,12 +2143,6 @@
         </w:tc>
       </w:tr>
       <w:tr>
-        <w:tblPrEx>
-          <w:tblCellMar>
-            <w:top w:w="0" w:type="dxa"/>
-            <w:bottom w:w="0" w:type="dxa"/>
-          </w:tblCellMar>
-        </w:tblPrEx>
         <w:tc>
           <w:tcPr>
             <w:tcW w:w="2000" w:type="dxa"/>
@@ -1738,6 +2170,86 @@
           <w:p>
             <w:r>
               <w:t>Zero-configuration, ACID-compliant embedded database ideal for managing structured student records, grades, timetables, and audit query logs locally.</w:t>
+            </w:r>
+          </w:p>
+        </w:tc>
+      </w:tr>
+      <w:tr>
+        <w:tc>
+          <w:tcPr>
+            <w:tcW w:w="2000" w:type="dxa"/>
+          </w:tcPr>
+          <w:p>
+            <w:r>
+              <w:t>Fact-Checking &amp; NLI</w:t>
+            </w:r>
+          </w:p>
+        </w:tc>
+        <w:tc>
+          <w:tcPr>
+            <w:tcW w:w="3000" w:type="dxa"/>
+          </w:tcPr>
+          <w:p>
+            <w:proofErr w:type="spellStart"/>
+            <w:r>
+              <w:t>HuggingFace</w:t>
+            </w:r>
+            <w:proofErr w:type="spellEnd"/>
+            <w:r>
+              <w:t> sentence-transformers</w:t>
+            </w:r>
+          </w:p>
+        </w:tc>
+        <w:tc>
+          <w:tcPr>
+            <w:tcW w:w="4350" w:type="dxa"/>
+          </w:tcPr>
+          <w:p>
+            <w:r>
+              <w:t>H</w:t>
+            </w:r>
+            <w:r>
+              <w:t>igh accuracy in detecting logical contradictions</w:t>
+            </w:r>
+          </w:p>
+        </w:tc>
+      </w:tr>
+      <w:tr>
+        <w:tc>
+          <w:tcPr>
+            <w:tcW w:w="2000" w:type="dxa"/>
+          </w:tcPr>
+          <w:p>
+            <w:r>
+              <w:t>NLP Sentence Processing</w:t>
+            </w:r>
+          </w:p>
+        </w:tc>
+        <w:tc>
+          <w:tcPr>
+            <w:tcW w:w="3000" w:type="dxa"/>
+          </w:tcPr>
+          <w:p>
+            <w:r>
+              <w:t>NLTK or </w:t>
+            </w:r>
+            <w:proofErr w:type="spellStart"/>
+            <w:r>
+              <w:t>SpaCy</w:t>
+            </w:r>
+            <w:proofErr w:type="spellEnd"/>
+          </w:p>
+        </w:tc>
+        <w:tc>
+          <w:tcPr>
+            <w:tcW w:w="4350" w:type="dxa"/>
+          </w:tcPr>
+          <w:p>
+            <w:r>
+              <w:t>I</w:t>
+            </w:r>
+            <w:r>
+              <w:t>nstantaneous, 100% offline text extraction</w:t>
             </w:r>
           </w:p>
         </w:tc>
@@ -1757,7 +2269,6 @@
           <w:sz w:val="30"/>
           <w:szCs w:val="30"/>
         </w:rPr>
-        <w:lastRenderedPageBreak/>
         <w:t xml:space="preserve">5.  </w:t>
       </w:r>
       <w:r>
@@ -1870,10 +2381,46 @@
     </w:p>
     <w:p>
       <w:pPr>
+        <w:rPr>
+          <w:sz w:val="24"/>
+          <w:szCs w:val="24"/>
+        </w:rPr>
+      </w:pPr>
+      <w:r>
+        <w:rPr>
+          <w:sz w:val="24"/>
+          <w:szCs w:val="24"/>
+        </w:rPr>
+        <w:t>•</w:t>
+      </w:r>
+      <w:r>
+        <w:rPr>
+          <w:sz w:val="24"/>
+          <w:szCs w:val="24"/>
+        </w:rPr>
+        <w:t xml:space="preserve"> </w:t>
+      </w:r>
+      <w:r>
+        <w:rPr>
+          <w:sz w:val="24"/>
+          <w:szCs w:val="24"/>
+        </w:rPr>
+        <w:t>Verification Compute Overhead: Assumes the host machine has sufficient CPU/GPU capacity to run the lightweight Cross-Encoder NLI model (~150MB parameter size) concurrently with the primary Qwen2.5 LLM generation process without causing severe latency bottlenecks.</w:t>
+      </w:r>
+    </w:p>
+    <w:p>
+      <w:pPr>
+        <w:pStyle w:val="ListParagraph"/>
+        <w:rPr>
+          <w:sz w:val="24"/>
+          <w:szCs w:val="24"/>
+        </w:rPr>
+      </w:pPr>
+    </w:p>
+    <w:p>
+      <w:pPr>
         <w:pStyle w:val="Heading1"/>
         <w:spacing w:before="400" w:after="160"/>
-      </w:pPr>
-      <w:r>
         <w:rPr>
           <w:rFonts w:ascii="Cambria" w:eastAsia="Cambria" w:hAnsi="Cambria" w:cs="Cambria"/>
           <w:b/>
@@ -1882,6 +2429,37 @@
           <w:sz w:val="30"/>
           <w:szCs w:val="30"/>
         </w:rPr>
+      </w:pPr>
+    </w:p>
+    <w:p>
+      <w:pPr>
+        <w:pStyle w:val="Heading1"/>
+        <w:spacing w:before="400" w:after="160"/>
+        <w:rPr>
+          <w:rFonts w:ascii="Cambria" w:eastAsia="Cambria" w:hAnsi="Cambria" w:cs="Cambria"/>
+          <w:b/>
+          <w:bCs/>
+          <w:color w:val="C97A1F"/>
+          <w:sz w:val="30"/>
+          <w:szCs w:val="30"/>
+        </w:rPr>
+      </w:pPr>
+    </w:p>
+    <w:p>
+      <w:pPr>
+        <w:pStyle w:val="Heading1"/>
+        <w:spacing w:before="400" w:after="160"/>
+      </w:pPr>
+      <w:r>
+        <w:rPr>
+          <w:rFonts w:ascii="Cambria" w:eastAsia="Cambria" w:hAnsi="Cambria" w:cs="Cambria"/>
+          <w:b/>
+          <w:bCs/>
+          <w:color w:val="C97A1F"/>
+          <w:sz w:val="30"/>
+          <w:szCs w:val="30"/>
+        </w:rPr>
+        <w:lastRenderedPageBreak/>
         <w:t xml:space="preserve">6.  </w:t>
       </w:r>
       <w:r>
@@ -1909,7 +2487,23 @@
           <w:sz w:val="24"/>
           <w:szCs w:val="24"/>
         </w:rPr>
-        <w:t>• Xiao, S., Liu, Z., Zhang, P., &amp; Muennighoff, N. (2023). C-Pack: Packaged Resources for General Chinese Embeddings (BAAI BGE Models). arXiv:2309.07597.</w:t>
+        <w:t xml:space="preserve">• Xiao, S., Liu, Z., Zhang, P., &amp; </w:t>
+      </w:r>
+      <w:proofErr w:type="spellStart"/>
+      <w:r>
+        <w:rPr>
+          <w:sz w:val="24"/>
+          <w:szCs w:val="24"/>
+        </w:rPr>
+        <w:t>Muennighoff</w:t>
+      </w:r>
+      <w:proofErr w:type="spellEnd"/>
+      <w:r>
+        <w:rPr>
+          <w:sz w:val="24"/>
+          <w:szCs w:val="24"/>
+        </w:rPr>
+        <w:t>, N. (2023). C-Pack: Packaged Resources for General Chinese Embeddings (BAAI BGE Models). arXiv:2309.07597.</w:t>
       </w:r>
     </w:p>
     <w:p>
@@ -1957,7 +2551,23 @@
           <w:sz w:val="24"/>
           <w:szCs w:val="24"/>
         </w:rPr>
-        <w:t>• Reimers, N., &amp; Gurevych, I. (2019). Sentence-BERT: Sentence Embeddings using Siamese BERT-Networks. Proceedings of EMNLP 2019.</w:t>
+        <w:t xml:space="preserve">• Reimers, N., &amp; </w:t>
+      </w:r>
+      <w:proofErr w:type="spellStart"/>
+      <w:r>
+        <w:rPr>
+          <w:sz w:val="24"/>
+          <w:szCs w:val="24"/>
+        </w:rPr>
+        <w:t>Gurevych</w:t>
+      </w:r>
+      <w:proofErr w:type="spellEnd"/>
+      <w:r>
+        <w:rPr>
+          <w:sz w:val="24"/>
+          <w:szCs w:val="24"/>
+        </w:rPr>
+        <w:t>, I. (2019). Sentence-BERT: Sentence Embeddings using Siamese BERT-Networks. Proceedings of EMNLP 2019.</w:t>
       </w:r>
     </w:p>
     <w:p>
@@ -1973,8 +2583,94 @@
           <w:sz w:val="24"/>
           <w:szCs w:val="24"/>
         </w:rPr>
-        <w:t>• Lewis, P., et al. (2020). Retrieval-Augmented Generation for Knowledge-Intensive NLP Tasks. Advances in Neural Information Processing Systems (NeurIPS), 33.</w:t>
-      </w:r>
+        <w:t>• Lewis, P., et al. (2020). Retrieval-Augmented Generation for Knowledge-Intensive NLP Tasks. Advances in Neural Information Processing Systems (</w:t>
+      </w:r>
+      <w:proofErr w:type="spellStart"/>
+      <w:r>
+        <w:rPr>
+          <w:sz w:val="24"/>
+          <w:szCs w:val="24"/>
+        </w:rPr>
+        <w:t>NeurIPS</w:t>
+      </w:r>
+      <w:proofErr w:type="spellEnd"/>
+      <w:r>
+        <w:rPr>
+          <w:sz w:val="24"/>
+          <w:szCs w:val="24"/>
+        </w:rPr>
+        <w:t>), 33.</w:t>
+      </w:r>
+    </w:p>
+    <w:p>
+      <w:pPr>
+        <w:rPr>
+          <w:sz w:val="24"/>
+          <w:szCs w:val="24"/>
+        </w:rPr>
+      </w:pPr>
+      <w:r>
+        <w:rPr>
+          <w:sz w:val="24"/>
+          <w:szCs w:val="24"/>
+        </w:rPr>
+        <w:t>•</w:t>
+      </w:r>
+      <w:r>
+        <w:rPr>
+          <w:sz w:val="24"/>
+          <w:szCs w:val="24"/>
+        </w:rPr>
+        <w:t xml:space="preserve"> </w:t>
+      </w:r>
+      <w:r>
+        <w:rPr>
+          <w:sz w:val="24"/>
+          <w:szCs w:val="24"/>
+        </w:rPr>
+        <w:t xml:space="preserve">He, P., Gao, J., &amp; Chen, W. (2021). DeBERTaV3: Improving </w:t>
+      </w:r>
+      <w:proofErr w:type="spellStart"/>
+      <w:r>
+        <w:rPr>
+          <w:sz w:val="24"/>
+          <w:szCs w:val="24"/>
+        </w:rPr>
+        <w:t>DeBERTa</w:t>
+      </w:r>
+      <w:proofErr w:type="spellEnd"/>
+      <w:r>
+        <w:rPr>
+          <w:sz w:val="24"/>
+          <w:szCs w:val="24"/>
+        </w:rPr>
+        <w:t xml:space="preserve"> using ELECTRA-Style Pre-Training with Gradient-Disentangled Embedding Sharing. </w:t>
+      </w:r>
+      <w:r>
+        <w:rPr>
+          <w:i/>
+          <w:iCs/>
+          <w:sz w:val="24"/>
+          <w:szCs w:val="24"/>
+        </w:rPr>
+        <w:t>arXiv:2111.09543</w:t>
+      </w:r>
+      <w:r>
+        <w:rPr>
+          <w:sz w:val="24"/>
+          <w:szCs w:val="24"/>
+        </w:rPr>
+        <w:t>.</w:t>
+      </w:r>
+    </w:p>
+    <w:p>
+      <w:pPr>
+        <w:pStyle w:val="ListParagraph"/>
+        <w:rPr>
+          <w:sz w:val="24"/>
+          <w:szCs w:val="24"/>
+        </w:rPr>
+      </w:pPr>
     </w:p>
     <w:sectPr>
       <w:headerReference w:type="default" r:id="rId8"/>
@@ -1989,7 +2685,7 @@
 </file>
 
 <file path=word/endnotes.xml><?xml version="1.0" encoding="utf-8"?>
-<w:endnotes xmlns:wpc="http://schemas.microsoft.com/office/word/2010/wordprocessingCanvas" xmlns:cx="http://schemas.microsoft.com/office/drawing/2014/chartex" xmlns:cx1="http://schemas.microsoft.com/office/drawing/2015/9/8/chartex" xmlns:cx2="http://schemas.microsoft.com/office/drawing/2015/10/21/chartex" xmlns:cx3="http://schemas.microsoft.com/office/drawing/2016/5/9/chartex" xmlns:cx4="http://schemas.microsoft.com/office/drawing/2016/5/10/chartex" xmlns:cx5="http://schemas.microsoft.com/office/drawing/2016/5/11/chartex" xmlns:cx6="http://schemas.microsoft.com/office/drawing/2016/5/12/chartex" xmlns:cx7="http://schemas.microsoft.com/office/drawing/2016/5/13/chartex" xmlns:cx8="http://schemas.microsoft.com/office/drawing/2016/5/14/chartex" xmlns:mc="http://schemas.openxmlformats.org/markup-compatibility/2006" xmlns:aink="http://schemas.microsoft.com/office/drawing/2016/ink" xmlns:am3d="http://schemas.microsoft.com/office/drawing/2017/model3d" xmlns:o="urn:schemas-microsoft-com:office:office" xmlns:oel="http://schemas.microsoft.com/office/2019/extlst" xmlns:r="http://schemas.openxmlformats.org/officeDocument/2006/relationships" xmlns:m="http://schemas.openxmlformats.org/officeDocument/2006/math" xmlns:v="urn:schemas-microsoft-com:vml" xmlns:wp14="http://schemas.microsoft.com/office/word/2010/wordprocessingDrawing" xmlns:wp="http://schemas.openxmlformats.org/drawingml/2006/wordprocessingDrawing" xmlns:w10="urn:schemas-microsoft-com:office:word" xmlns:w="http://schemas.openxmlformats.org/wordprocessingml/2006/main" xmlns:w14="http://schemas.microsoft.com/office/word/2010/wordml" xmlns:w15="http://schemas.microsoft.com/office/word/2012/wordml" xmlns:w16cei="http://schemas.microsoft.com/office/word/2026/wordml/cei" xmlns:w16cex="http://schemas.microsoft.com/office/word/2018/wordml/cex" xmlns:w16cid="http://schemas.microsoft.com/office/word/2016/wordml/cid" xmlns:w16="http://schemas.microsoft.com/office/word/2018/wordml" xmlns:w16du="http://schemas.microsoft.com/office/word/2023/wordml/word16du" xmlns:w16sdtdh="http://schemas.microsoft.com/office/word/2020/wordml/sdtdatahash" xmlns:w16sdtfl="http://schemas.microsoft.com/office/word/2024/wordml/sdtformatlock" xmlns:w16se="http://schemas.microsoft.com/office/word/2015/wordml/symex" xmlns:wpg="http://schemas.microsoft.com/office/word/2010/wordprocessingGroup" xmlns:wpi="http://schemas.microsoft.com/office/word/2010/wordprocessingInk" xmlns:wne="http://schemas.microsoft.com/office/word/2006/wordml" xmlns:wps="http://schemas.microsoft.com/office/word/2010/wordprocessingShape" mc:Ignorable="w14 w15 w16se w16cid w16 w16cex w16sdtdh w16sdtfl w16du wp14">
+<w:endnotes xmlns:wpc="http://schemas.microsoft.com/office/word/2010/wordprocessingCanvas" xmlns:cx="http://schemas.microsoft.com/office/drawing/2014/chartex" xmlns:cx1="http://schemas.microsoft.com/office/drawing/2015/9/8/chartex" xmlns:cx2="http://schemas.microsoft.com/office/drawing/2015/10/21/chartex" xmlns:cx3="http://schemas.microsoft.com/office/drawing/2016/5/9/chartex" xmlns:cx4="http://schemas.microsoft.com/office/drawing/2016/5/10/chartex" xmlns:cx5="http://schemas.microsoft.com/office/drawing/2016/5/11/chartex" xmlns:cx6="http://schemas.microsoft.com/office/drawing/2016/5/12/chartex" xmlns:cx7="http://schemas.microsoft.com/office/drawing/2016/5/13/chartex" xmlns:cx8="http://schemas.microsoft.com/office/drawing/2016/5/14/chartex" xmlns:mc="http://schemas.openxmlformats.org/markup-compatibility/2006" xmlns:aink="http://schemas.microsoft.com/office/drawing/2016/ink" xmlns:am3d="http://schemas.microsoft.com/office/drawing/2017/model3d" xmlns:o="urn:schemas-microsoft-com:office:office" xmlns:oel="http://schemas.microsoft.com/office/2019/extlst" xmlns:r="http://schemas.openxmlformats.org/officeDocument/2006/relationships" xmlns:m="http://schemas.openxmlformats.org/officeDocument/2006/math" xmlns:v="urn:schemas-microsoft-com:vml" xmlns:wp14="http://schemas.microsoft.com/office/word/2010/wordprocessingDrawing" xmlns:wp="http://schemas.openxmlformats.org/drawingml/2006/wordprocessingDrawing" xmlns:w10="urn:schemas-microsoft-com:office:word" xmlns:w="http://schemas.openxmlformats.org/wordprocessingml/2006/main" xmlns:w14="http://schemas.microsoft.com/office/word/2010/wordml" xmlns:w15="http://schemas.microsoft.com/office/word/2012/wordml" xmlns:w16cex="http://schemas.microsoft.com/office/word/2018/wordml/cex" xmlns:w16cid="http://schemas.microsoft.com/office/word/2016/wordml/cid" xmlns:w16="http://schemas.microsoft.com/office/word/2018/wordml" xmlns:w16du="http://schemas.microsoft.com/office/word/2023/wordml/word16du" xmlns:w16sdtdh="http://schemas.microsoft.com/office/word/2020/wordml/sdtdatahash" xmlns:w16sdtfl="http://schemas.microsoft.com/office/word/2024/wordml/sdtformatlock" xmlns:w16se="http://schemas.microsoft.com/office/word/2015/wordml/symex" xmlns:wpg="http://schemas.microsoft.com/office/word/2010/wordprocessingGroup" xmlns:wpi="http://schemas.microsoft.com/office/word/2010/wordprocessingInk" xmlns:wne="http://schemas.microsoft.com/office/word/2006/wordml" xmlns:wps="http://schemas.microsoft.com/office/word/2010/wordprocessingShape" mc:Ignorable="w14 w15 w16se w16cid w16 w16cex w16sdtdh w16sdtfl w16du wp14">
   <w:endnote w:type="separator" w:id="-1">
     <w:p>
       <w:r>
@@ -2008,7 +2704,7 @@
 </file>
 
 <file path=word/footer1.xml><?xml version="1.0" encoding="utf-8"?>
-<w:ftr xmlns:wpc="http://schemas.microsoft.com/office/word/2010/wordprocessingCanvas" xmlns:cx="http://schemas.microsoft.com/office/drawing/2014/chartex" xmlns:cx1="http://schemas.microsoft.com/office/drawing/2015/9/8/chartex" xmlns:cx2="http://schemas.microsoft.com/office/drawing/2015/10/21/chartex" xmlns:cx3="http://schemas.microsoft.com/office/drawing/2016/5/9/chartex" xmlns:cx4="http://schemas.microsoft.com/office/drawing/2016/5/10/chartex" xmlns:cx5="http://schemas.microsoft.com/office/drawing/2016/5/11/chartex" xmlns:cx6="http://schemas.microsoft.com/office/drawing/2016/5/12/chartex" xmlns:cx7="http://schemas.microsoft.com/office/drawing/2016/5/13/chartex" xmlns:cx8="http://schemas.microsoft.com/office/drawing/2016/5/14/chartex" xmlns:mc="http://schemas.openxmlformats.org/markup-compatibility/2006" xmlns:aink="http://schemas.microsoft.com/office/drawing/2016/ink" xmlns:am3d="http://schemas.microsoft.com/office/drawing/2017/model3d" xmlns:o="urn:schemas-microsoft-com:office:office" xmlns:oel="http://schemas.microsoft.com/office/2019/extlst" xmlns:r="http://schemas.openxmlformats.org/officeDocument/2006/relationships" xmlns:m="http://schemas.openxmlformats.org/officeDocument/2006/math" xmlns:v="urn:schemas-microsoft-com:vml" xmlns:wp14="http://schemas.microsoft.com/office/word/2010/wordprocessingDrawing" xmlns:wp="http://schemas.openxmlformats.org/drawingml/2006/wordprocessingDrawing" xmlns:w10="urn:schemas-microsoft-com:office:word" xmlns:w="http://schemas.openxmlformats.org/wordprocessingml/2006/main" xmlns:w14="http://schemas.microsoft.com/office/word/2010/wordml" xmlns:w15="http://schemas.microsoft.com/office/word/2012/wordml" xmlns:w16cei="http://schemas.microsoft.com/office/word/2026/wordml/cei" xmlns:w16cex="http://schemas.microsoft.com/office/word/2018/wordml/cex" xmlns:w16cid="http://schemas.microsoft.com/office/word/2016/wordml/cid" xmlns:w16="http://schemas.microsoft.com/office/word/2018/wordml" xmlns:w16du="http://schemas.microsoft.com/office/word/2023/wordml/word16du" xmlns:w16sdtdh="http://schemas.microsoft.com/office/word/2020/wordml/sdtdatahash" xmlns:w16sdtfl="http://schemas.microsoft.com/office/word/2024/wordml/sdtformatlock" xmlns:w16se="http://schemas.microsoft.com/office/word/2015/wordml/symex" xmlns:wpg="http://schemas.microsoft.com/office/word/2010/wordprocessingGroup" xmlns:wpi="http://schemas.microsoft.com/office/word/2010/wordprocessingInk" xmlns:wne="http://schemas.microsoft.com/office/word/2006/wordml" xmlns:wps="http://schemas.microsoft.com/office/word/2010/wordprocessingShape" mc:Ignorable="w14 w15 w16se w16cid w16 w16cex w16sdtdh w16sdtfl w16du wp14">
+<w:ftr xmlns:wpc="http://schemas.microsoft.com/office/word/2010/wordprocessingCanvas" xmlns:cx="http://schemas.microsoft.com/office/drawing/2014/chartex" xmlns:cx1="http://schemas.microsoft.com/office/drawing/2015/9/8/chartex" xmlns:cx2="http://schemas.microsoft.com/office/drawing/2015/10/21/chartex" xmlns:cx3="http://schemas.microsoft.com/office/drawing/2016/5/9/chartex" xmlns:cx4="http://schemas.microsoft.com/office/drawing/2016/5/10/chartex" xmlns:cx5="http://schemas.microsoft.com/office/drawing/2016/5/11/chartex" xmlns:cx6="http://schemas.microsoft.com/office/drawing/2016/5/12/chartex" xmlns:cx7="http://schemas.microsoft.com/office/drawing/2016/5/13/chartex" xmlns:cx8="http://schemas.microsoft.com/office/drawing/2016/5/14/chartex" xmlns:mc="http://schemas.openxmlformats.org/markup-compatibility/2006" xmlns:aink="http://schemas.microsoft.com/office/drawing/2016/ink" xmlns:am3d="http://schemas.microsoft.com/office/drawing/2017/model3d" xmlns:o="urn:schemas-microsoft-com:office:office" xmlns:oel="http://schemas.microsoft.com/office/2019/extlst" xmlns:r="http://schemas.openxmlformats.org/officeDocument/2006/relationships" xmlns:m="http://schemas.openxmlformats.org/officeDocument/2006/math" xmlns:v="urn:schemas-microsoft-com:vml" xmlns:wp14="http://schemas.microsoft.com/office/word/2010/wordprocessingDrawing" xmlns:wp="http://schemas.openxmlformats.org/drawingml/2006/wordprocessingDrawing" xmlns:w10="urn:schemas-microsoft-com:office:word" xmlns:w="http://schemas.openxmlformats.org/wordprocessingml/2006/main" xmlns:w14="http://schemas.microsoft.com/office/word/2010/wordml" xmlns:w15="http://schemas.microsoft.com/office/word/2012/wordml" xmlns:w16cex="http://schemas.microsoft.com/office/word/2018/wordml/cex" xmlns:w16cid="http://schemas.microsoft.com/office/word/2016/wordml/cid" xmlns:w16="http://schemas.microsoft.com/office/word/2018/wordml" xmlns:w16du="http://schemas.microsoft.com/office/word/2023/wordml/word16du" xmlns:w16sdtdh="http://schemas.microsoft.com/office/word/2020/wordml/sdtdatahash" xmlns:w16sdtfl="http://schemas.microsoft.com/office/word/2024/wordml/sdtformatlock" xmlns:w16se="http://schemas.microsoft.com/office/word/2015/wordml/symex" xmlns:wpg="http://schemas.microsoft.com/office/word/2010/wordprocessingGroup" xmlns:wpi="http://schemas.microsoft.com/office/word/2010/wordprocessingInk" xmlns:wne="http://schemas.microsoft.com/office/word/2006/wordml" xmlns:wps="http://schemas.microsoft.com/office/word/2010/wordprocessingShape" mc:Ignorable="w14 w15 w16se w16cid w16 w16cex w16sdtdh w16sdtfl w16du wp14">
   <w:p>
     <w:pPr>
       <w:jc w:val="center"/>
@@ -2073,7 +2769,7 @@
 </file>
 
 <file path=word/footnotes.xml><?xml version="1.0" encoding="utf-8"?>
-<w:footnotes xmlns:wpc="http://schemas.microsoft.com/office/word/2010/wordprocessingCanvas" xmlns:cx="http://schemas.microsoft.com/office/drawing/2014/chartex" xmlns:cx1="http://schemas.microsoft.com/office/drawing/2015/9/8/chartex" xmlns:cx2="http://schemas.microsoft.com/office/drawing/2015/10/21/chartex" xmlns:cx3="http://schemas.microsoft.com/office/drawing/2016/5/9/chartex" xmlns:cx4="http://schemas.microsoft.com/office/drawing/2016/5/10/chartex" xmlns:cx5="http://schemas.microsoft.com/office/drawing/2016/5/11/chartex" xmlns:cx6="http://schemas.microsoft.com/office/drawing/2016/5/12/chartex" xmlns:cx7="http://schemas.microsoft.com/office/drawing/2016/5/13/chartex" xmlns:cx8="http://schemas.microsoft.com/office/drawing/2016/5/14/chartex" xmlns:mc="http://schemas.openxmlformats.org/markup-compatibility/2006" xmlns:aink="http://schemas.microsoft.com/office/drawing/2016/ink" xmlns:am3d="http://schemas.microsoft.com/office/drawing/2017/model3d" xmlns:o="urn:schemas-microsoft-com:office:office" xmlns:oel="http://schemas.microsoft.com/office/2019/extlst" xmlns:r="http://schemas.openxmlformats.org/officeDocument/2006/relationships" xmlns:m="http://schemas.openxmlformats.org/officeDocument/2006/math" xmlns:v="urn:schemas-microsoft-com:vml" xmlns:wp14="http://schemas.microsoft.com/office/word/2010/wordprocessingDrawing" xmlns:wp="http://schemas.openxmlformats.org/drawingml/2006/wordprocessingDrawing" xmlns:w10="urn:schemas-microsoft-com:office:word" xmlns:w="http://schemas.openxmlformats.org/wordprocessingml/2006/main" xmlns:w14="http://schemas.microsoft.com/office/word/2010/wordml" xmlns:w15="http://schemas.microsoft.com/office/word/2012/wordml" xmlns:w16cei="http://schemas.microsoft.com/office/word/2026/wordml/cei" xmlns:w16cex="http://schemas.microsoft.com/office/word/2018/wordml/cex" xmlns:w16cid="http://schemas.microsoft.com/office/word/2016/wordml/cid" xmlns:w16="http://schemas.microsoft.com/office/word/2018/wordml" xmlns:w16du="http://schemas.microsoft.com/office/word/2023/wordml/word16du" xmlns:w16sdtdh="http://schemas.microsoft.com/office/word/2020/wordml/sdtdatahash" xmlns:w16sdtfl="http://schemas.microsoft.com/office/word/2024/wordml/sdtformatlock" xmlns:w16se="http://schemas.microsoft.com/office/word/2015/wordml/symex" xmlns:wpg="http://schemas.microsoft.com/office/word/2010/wordprocessingGroup" xmlns:wpi="http://schemas.microsoft.com/office/word/2010/wordprocessingInk" xmlns:wne="http://schemas.microsoft.com/office/word/2006/wordml" xmlns:wps="http://schemas.microsoft.com/office/word/2010/wordprocessingShape" mc:Ignorable="w14 w15 w16se w16cid w16 w16cex w16sdtdh w16sdtfl w16du wp14">
+<w:footnotes xmlns:wpc="http://schemas.microsoft.com/office/word/2010/wordprocessingCanvas" xmlns:cx="http://schemas.microsoft.com/office/drawing/2014/chartex" xmlns:cx1="http://schemas.microsoft.com/office/drawing/2015/9/8/chartex" xmlns:cx2="http://schemas.microsoft.com/office/drawing/2015/10/21/chartex" xmlns:cx3="http://schemas.microsoft.com/office/drawing/2016/5/9/chartex" xmlns:cx4="http://schemas.microsoft.com/office/drawing/2016/5/10/chartex" xmlns:cx5="http://schemas.microsoft.com/office/drawing/2016/5/11/chartex" xmlns:cx6="http://schemas.microsoft.com/office/drawing/2016/5/12/chartex" xmlns:cx7="http://schemas.microsoft.com/office/drawing/2016/5/13/chartex" xmlns:cx8="http://schemas.microsoft.com/office/drawing/2016/5/14/chartex" xmlns:mc="http://schemas.openxmlformats.org/markup-compatibility/2006" xmlns:aink="http://schemas.microsoft.com/office/drawing/2016/ink" xmlns:am3d="http://schemas.microsoft.com/office/drawing/2017/model3d" xmlns:o="urn:schemas-microsoft-com:office:office" xmlns:oel="http://schemas.microsoft.com/office/2019/extlst" xmlns:r="http://schemas.openxmlformats.org/officeDocument/2006/relationships" xmlns:m="http://schemas.openxmlformats.org/officeDocument/2006/math" xmlns:v="urn:schemas-microsoft-com:vml" xmlns:wp14="http://schemas.microsoft.com/office/word/2010/wordprocessingDrawing" xmlns:wp="http://schemas.openxmlformats.org/drawingml/2006/wordprocessingDrawing" xmlns:w10="urn:schemas-microsoft-com:office:word" xmlns:w="http://schemas.openxmlformats.org/wordprocessingml/2006/main" xmlns:w14="http://schemas.microsoft.com/office/word/2010/wordml" xmlns:w15="http://schemas.microsoft.com/office/word/2012/wordml" xmlns:w16cex="http://schemas.microsoft.com/office/word/2018/wordml/cex" xmlns:w16cid="http://schemas.microsoft.com/office/word/2016/wordml/cid" xmlns:w16="http://schemas.microsoft.com/office/word/2018/wordml" xmlns:w16du="http://schemas.microsoft.com/office/word/2023/wordml/word16du" xmlns:w16sdtdh="http://schemas.microsoft.com/office/word/2020/wordml/sdtdatahash" xmlns:w16sdtfl="http://schemas.microsoft.com/office/word/2024/wordml/sdtformatlock" xmlns:w16se="http://schemas.microsoft.com/office/word/2015/wordml/symex" xmlns:wpg="http://schemas.microsoft.com/office/word/2010/wordprocessingGroup" xmlns:wpi="http://schemas.microsoft.com/office/word/2010/wordprocessingInk" xmlns:wne="http://schemas.microsoft.com/office/word/2006/wordml" xmlns:wps="http://schemas.microsoft.com/office/word/2010/wordprocessingShape" mc:Ignorable="w14 w15 w16se w16cid w16 w16cex w16sdtdh w16sdtfl w16du wp14">
   <w:footnote w:type="separator" w:id="-1">
     <w:p>
       <w:r>
@@ -2092,11 +2788,12 @@
 </file>
 
 <file path=word/header1.xml><?xml version="1.0" encoding="utf-8"?>
-<w:hdr xmlns:wpc="http://schemas.microsoft.com/office/word/2010/wordprocessingCanvas" xmlns:cx="http://schemas.microsoft.com/office/drawing/2014/chartex" xmlns:cx1="http://schemas.microsoft.com/office/drawing/2015/9/8/chartex" xmlns:cx2="http://schemas.microsoft.com/office/drawing/2015/10/21/chartex" xmlns:cx3="http://schemas.microsoft.com/office/drawing/2016/5/9/chartex" xmlns:cx4="http://schemas.microsoft.com/office/drawing/2016/5/10/chartex" xmlns:cx5="http://schemas.microsoft.com/office/drawing/2016/5/11/chartex" xmlns:cx6="http://schemas.microsoft.com/office/drawing/2016/5/12/chartex" xmlns:cx7="http://schemas.microsoft.com/office/drawing/2016/5/13/chartex" xmlns:cx8="http://schemas.microsoft.com/office/drawing/2016/5/14/chartex" xmlns:mc="http://schemas.openxmlformats.org/markup-compatibility/2006" xmlns:aink="http://schemas.microsoft.com/office/drawing/2016/ink" xmlns:am3d="http://schemas.microsoft.com/office/drawing/2017/model3d" xmlns:o="urn:schemas-microsoft-com:office:office" xmlns:oel="http://schemas.microsoft.com/office/2019/extlst" xmlns:r="http://schemas.openxmlformats.org/officeDocument/2006/relationships" xmlns:m="http://schemas.openxmlformats.org/officeDocument/2006/math" xmlns:v="urn:schemas-microsoft-com:vml" xmlns:wp14="http://schemas.microsoft.com/office/word/2010/wordprocessingDrawing" xmlns:wp="http://schemas.openxmlformats.org/drawingml/2006/wordprocessingDrawing" xmlns:w10="urn:schemas-microsoft-com:office:word" xmlns:w="http://schemas.openxmlformats.org/wordprocessingml/2006/main" xmlns:w14="http://schemas.microsoft.com/office/word/2010/wordml" xmlns:w15="http://schemas.microsoft.com/office/word/2012/wordml" xmlns:w16cei="http://schemas.microsoft.com/office/word/2026/wordml/cei" xmlns:w16cex="http://schemas.microsoft.com/office/word/2018/wordml/cex" xmlns:w16cid="http://schemas.microsoft.com/office/word/2016/wordml/cid" xmlns:w16="http://schemas.microsoft.com/office/word/2018/wordml" xmlns:w16du="http://schemas.microsoft.com/office/word/2023/wordml/word16du" xmlns:w16sdtdh="http://schemas.microsoft.com/office/word/2020/wordml/sdtdatahash" xmlns:w16sdtfl="http://schemas.microsoft.com/office/word/2024/wordml/sdtformatlock" xmlns:w16se="http://schemas.microsoft.com/office/word/2015/wordml/symex" xmlns:wpg="http://schemas.microsoft.com/office/word/2010/wordprocessingGroup" xmlns:wpi="http://schemas.microsoft.com/office/word/2010/wordprocessingInk" xmlns:wne="http://schemas.microsoft.com/office/word/2006/wordml" xmlns:wps="http://schemas.microsoft.com/office/word/2010/wordprocessingShape" mc:Ignorable="w14 w15 w16se w16cid w16 w16cex w16sdtdh w16sdtfl w16du wp14">
+<w:hdr xmlns:wpc="http://schemas.microsoft.com/office/word/2010/wordprocessingCanvas" xmlns:cx="http://schemas.microsoft.com/office/drawing/2014/chartex" xmlns:cx1="http://schemas.microsoft.com/office/drawing/2015/9/8/chartex" xmlns:cx2="http://schemas.microsoft.com/office/drawing/2015/10/21/chartex" xmlns:cx3="http://schemas.microsoft.com/office/drawing/2016/5/9/chartex" xmlns:cx4="http://schemas.microsoft.com/office/drawing/2016/5/10/chartex" xmlns:cx5="http://schemas.microsoft.com/office/drawing/2016/5/11/chartex" xmlns:cx6="http://schemas.microsoft.com/office/drawing/2016/5/12/chartex" xmlns:cx7="http://schemas.microsoft.com/office/drawing/2016/5/13/chartex" xmlns:cx8="http://schemas.microsoft.com/office/drawing/2016/5/14/chartex" xmlns:mc="http://schemas.openxmlformats.org/markup-compatibility/2006" xmlns:aink="http://schemas.microsoft.com/office/drawing/2016/ink" xmlns:am3d="http://schemas.microsoft.com/office/drawing/2017/model3d" xmlns:o="urn:schemas-microsoft-com:office:office" xmlns:oel="http://schemas.microsoft.com/office/2019/extlst" xmlns:r="http://schemas.openxmlformats.org/officeDocument/2006/relationships" xmlns:m="http://schemas.openxmlformats.org/officeDocument/2006/math" xmlns:v="urn:schemas-microsoft-com:vml" xmlns:wp14="http://schemas.microsoft.com/office/word/2010/wordprocessingDrawing" xmlns:wp="http://schemas.openxmlformats.org/drawingml/2006/wordprocessingDrawing" xmlns:w10="urn:schemas-microsoft-com:office:word" xmlns:w="http://schemas.openxmlformats.org/wordprocessingml/2006/main" xmlns:w14="http://schemas.microsoft.com/office/word/2010/wordml" xmlns:w15="http://schemas.microsoft.com/office/word/2012/wordml" xmlns:w16cex="http://schemas.microsoft.com/office/word/2018/wordml/cex" xmlns:w16cid="http://schemas.microsoft.com/office/word/2016/wordml/cid" xmlns:w16="http://schemas.microsoft.com/office/word/2018/wordml" xmlns:w16du="http://schemas.microsoft.com/office/word/2023/wordml/word16du" xmlns:w16sdtdh="http://schemas.microsoft.com/office/word/2020/wordml/sdtdatahash" xmlns:w16sdtfl="http://schemas.microsoft.com/office/word/2024/wordml/sdtformatlock" xmlns:w16se="http://schemas.microsoft.com/office/word/2015/wordml/symex" xmlns:wpg="http://schemas.microsoft.com/office/word/2010/wordprocessingGroup" xmlns:wpi="http://schemas.microsoft.com/office/word/2010/wordprocessingInk" xmlns:wne="http://schemas.microsoft.com/office/word/2006/wordml" xmlns:wps="http://schemas.microsoft.com/office/word/2010/wordprocessingShape" mc:Ignorable="w14 w15 w16se w16cid w16 w16cex w16sdtdh w16sdtfl w16du wp14">
   <w:p>
     <w:pPr>
       <w:jc w:val="right"/>
     </w:pPr>
+    <w:proofErr w:type="spellStart"/>
     <w:r>
       <w:rPr>
         <w:rFonts w:ascii="Calibri" w:eastAsia="Calibri" w:hAnsi="Calibri" w:cs="Calibri"/>
@@ -2104,15 +2801,174 @@
         <w:sz w:val="16"/>
         <w:szCs w:val="16"/>
       </w:rPr>
-      <w:t>HackWithAMYPO 2026 — Technical Documentation</w:t>
+      <w:t>HackWithAMYPO</w:t>
+    </w:r>
+    <w:proofErr w:type="spellEnd"/>
+    <w:r>
+      <w:rPr>
+        <w:rFonts w:ascii="Calibri" w:eastAsia="Calibri" w:hAnsi="Calibri" w:cs="Calibri"/>
+        <w:color w:val="6B7785"/>
+        <w:sz w:val="16"/>
+        <w:szCs w:val="16"/>
+      </w:rPr>
+      <w:t xml:space="preserve"> 2026 — Technical Documentation</w:t>
     </w:r>
   </w:p>
 </w:hdr>
 </file>
 
 <file path=word/numbering.xml><?xml version="1.0" encoding="utf-8"?>
-<w:numbering xmlns:wpc="http://schemas.microsoft.com/office/word/2010/wordprocessingCanvas" xmlns:cx="http://schemas.microsoft.com/office/drawing/2014/chartex" xmlns:cx1="http://schemas.microsoft.com/office/drawing/2015/9/8/chartex" xmlns:cx2="http://schemas.microsoft.com/office/drawing/2015/10/21/chartex" xmlns:cx3="http://schemas.microsoft.com/office/drawing/2016/5/9/chartex" xmlns:cx4="http://schemas.microsoft.com/office/drawing/2016/5/10/chartex" xmlns:cx5="http://schemas.microsoft.com/office/drawing/2016/5/11/chartex" xmlns:cx6="http://schemas.microsoft.com/office/drawing/2016/5/12/chartex" xmlns:cx7="http://schemas.microsoft.com/office/drawing/2016/5/13/chartex" xmlns:cx8="http://schemas.microsoft.com/office/drawing/2016/5/14/chartex" xmlns:mc="http://schemas.openxmlformats.org/markup-compatibility/2006" xmlns:aink="http://schemas.microsoft.com/office/drawing/2016/ink" xmlns:am3d="http://schemas.microsoft.com/office/drawing/2017/model3d" xmlns:o="urn:schemas-microsoft-com:office:office" xmlns:oel="http://schemas.microsoft.com/office/2019/extlst" xmlns:r="http://schemas.openxmlformats.org/officeDocument/2006/relationships" xmlns:m="http://schemas.openxmlformats.org/officeDocument/2006/math" xmlns:v="urn:schemas-microsoft-com:vml" xmlns:wp14="http://schemas.microsoft.com/office/word/2010/wordprocessingDrawing" xmlns:wp="http://schemas.openxmlformats.org/drawingml/2006/wordprocessingDrawing" xmlns:w10="urn:schemas-microsoft-com:office:word" xmlns:w="http://schemas.openxmlformats.org/wordprocessingml/2006/main" xmlns:w14="http://schemas.microsoft.com/office/word/2010/wordml" xmlns:w15="http://schemas.microsoft.com/office/word/2012/wordml" xmlns:w16cei="http://schemas.microsoft.com/office/word/2026/wordml/cei" xmlns:w16cex="http://schemas.microsoft.com/office/word/2018/wordml/cex" xmlns:w16cid="http://schemas.microsoft.com/office/word/2016/wordml/cid" xmlns:w16="http://schemas.microsoft.com/office/word/2018/wordml" xmlns:w16du="http://schemas.microsoft.com/office/word/2023/wordml/word16du" xmlns:w16sdtdh="http://schemas.microsoft.com/office/word/2020/wordml/sdtdatahash" xmlns:w16sdtfl="http://schemas.microsoft.com/office/word/2024/wordml/sdtformatlock" xmlns:w16se="http://schemas.microsoft.com/office/word/2015/wordml/symex" xmlns:wpg="http://schemas.microsoft.com/office/word/2010/wordprocessingGroup" xmlns:wpi="http://schemas.microsoft.com/office/word/2010/wordprocessingInk" xmlns:wne="http://schemas.microsoft.com/office/word/2006/wordml" xmlns:wps="http://schemas.microsoft.com/office/word/2010/wordprocessingShape" mc:Ignorable="w14 w15 w16se w16cid w16 w16cex w16sdtdh w16sdtfl w16du wp14">
+<w:numbering xmlns:wpc="http://schemas.microsoft.com/office/word/2010/wordprocessingCanvas" xmlns:cx="http://schemas.microsoft.com/office/drawing/2014/chartex" xmlns:cx1="http://schemas.microsoft.com/office/drawing/2015/9/8/chartex" xmlns:cx2="http://schemas.microsoft.com/office/drawing/2015/10/21/chartex" xmlns:cx3="http://schemas.microsoft.com/office/drawing/2016/5/9/chartex" xmlns:cx4="http://schemas.microsoft.com/office/drawing/2016/5/10/chartex" xmlns:cx5="http://schemas.microsoft.com/office/drawing/2016/5/11/chartex" xmlns:cx6="http://schemas.microsoft.com/office/drawing/2016/5/12/chartex" xmlns:cx7="http://schemas.microsoft.com/office/drawing/2016/5/13/chartex" xmlns:cx8="http://schemas.microsoft.com/office/drawing/2016/5/14/chartex" xmlns:mc="http://schemas.openxmlformats.org/markup-compatibility/2006" xmlns:aink="http://schemas.microsoft.com/office/drawing/2016/ink" xmlns:am3d="http://schemas.microsoft.com/office/drawing/2017/model3d" xmlns:o="urn:schemas-microsoft-com:office:office" xmlns:oel="http://schemas.microsoft.com/office/2019/extlst" xmlns:r="http://schemas.openxmlformats.org/officeDocument/2006/relationships" xmlns:m="http://schemas.openxmlformats.org/officeDocument/2006/math" xmlns:v="urn:schemas-microsoft-com:vml" xmlns:wp14="http://schemas.microsoft.com/office/word/2010/wordprocessingDrawing" xmlns:wp="http://schemas.openxmlformats.org/drawingml/2006/wordprocessingDrawing" xmlns:w10="urn:schemas-microsoft-com:office:word" xmlns:w="http://schemas.openxmlformats.org/wordprocessingml/2006/main" xmlns:w14="http://schemas.microsoft.com/office/word/2010/wordml" xmlns:w15="http://schemas.microsoft.com/office/word/2012/wordml" xmlns:w16cex="http://schemas.microsoft.com/office/word/2018/wordml/cex" xmlns:w16cid="http://schemas.microsoft.com/office/word/2016/wordml/cid" xmlns:w16="http://schemas.microsoft.com/office/word/2018/wordml" xmlns:w16du="http://schemas.microsoft.com/office/word/2023/wordml/word16du" xmlns:w16sdtdh="http://schemas.microsoft.com/office/word/2020/wordml/sdtdatahash" xmlns:w16sdtfl="http://schemas.microsoft.com/office/word/2024/wordml/sdtformatlock" xmlns:w16se="http://schemas.microsoft.com/office/word/2015/wordml/symex" xmlns:wpg="http://schemas.microsoft.com/office/word/2010/wordprocessingGroup" xmlns:wpi="http://schemas.microsoft.com/office/word/2010/wordprocessingInk" xmlns:wne="http://schemas.microsoft.com/office/word/2006/wordml" xmlns:wps="http://schemas.microsoft.com/office/word/2010/wordprocessingShape" mc:Ignorable="w14 w15 w16se w16cid w16 w16cex w16sdtdh w16sdtfl w16du wp14">
   <w:abstractNum w:abstractNumId="0" w15:restartNumberingAfterBreak="0">
+    <w:nsid w:val="010B3202"/>
+    <w:multiLevelType w:val="multilevel"/>
+    <w:tmpl w:val="7DEADF98"/>
+    <w:lvl w:ilvl="0">
+      <w:start w:val="1"/>
+      <w:numFmt w:val="bullet"/>
+      <w:lvlText w:val=""/>
+      <w:lvlJc w:val="left"/>
+      <w:pPr>
+        <w:tabs>
+          <w:tab w:val="num" w:pos="720"/>
+        </w:tabs>
+        <w:ind w:left="720" w:hanging="360"/>
+      </w:pPr>
+      <w:rPr>
+        <w:rFonts w:ascii="Symbol" w:hAnsi="Symbol" w:hint="default"/>
+        <w:sz w:val="20"/>
+      </w:rPr>
+    </w:lvl>
+    <w:lvl w:ilvl="1" w:tentative="1">
+      <w:start w:val="1"/>
+      <w:numFmt w:val="bullet"/>
+      <w:lvlText w:val=""/>
+      <w:lvlJc w:val="left"/>
+      <w:pPr>
+        <w:tabs>
+          <w:tab w:val="num" w:pos="1440"/>
+        </w:tabs>
+        <w:ind w:left="1440" w:hanging="360"/>
+      </w:pPr>
+      <w:rPr>
+        <w:rFonts w:ascii="Symbol" w:hAnsi="Symbol" w:hint="default"/>
+        <w:sz w:val="20"/>
+      </w:rPr>
+    </w:lvl>
+    <w:lvl w:ilvl="2" w:tentative="1">
+      <w:start w:val="1"/>
+      <w:numFmt w:val="bullet"/>
+      <w:lvlText w:val=""/>
+      <w:lvlJc w:val="left"/>
+      <w:pPr>
+        <w:tabs>
+          <w:tab w:val="num" w:pos="2160"/>
+        </w:tabs>
+        <w:ind w:left="2160" w:hanging="360"/>
+      </w:pPr>
+      <w:rPr>
+        <w:rFonts w:ascii="Symbol" w:hAnsi="Symbol" w:hint="default"/>
+        <w:sz w:val="20"/>
+      </w:rPr>
+    </w:lvl>
+    <w:lvl w:ilvl="3" w:tentative="1">
+      <w:start w:val="1"/>
+      <w:numFmt w:val="bullet"/>
+      <w:lvlText w:val=""/>
+      <w:lvlJc w:val="left"/>
+      <w:pPr>
+        <w:tabs>
+          <w:tab w:val="num" w:pos="2880"/>
+        </w:tabs>
+        <w:ind w:left="2880" w:hanging="360"/>
+      </w:pPr>
+      <w:rPr>
+        <w:rFonts w:ascii="Symbol" w:hAnsi="Symbol" w:hint="default"/>
+        <w:sz w:val="20"/>
+      </w:rPr>
+    </w:lvl>
+    <w:lvl w:ilvl="4" w:tentative="1">
+      <w:start w:val="1"/>
+      <w:numFmt w:val="bullet"/>
+      <w:lvlText w:val=""/>
+      <w:lvlJc w:val="left"/>
+      <w:pPr>
+        <w:tabs>
+          <w:tab w:val="num" w:pos="3600"/>
+        </w:tabs>
+        <w:ind w:left="3600" w:hanging="360"/>
+      </w:pPr>
+      <w:rPr>
+        <w:rFonts w:ascii="Symbol" w:hAnsi="Symbol" w:hint="default"/>
+        <w:sz w:val="20"/>
+      </w:rPr>
+    </w:lvl>
+    <w:lvl w:ilvl="5" w:tentative="1">
+      <w:start w:val="1"/>
+      <w:numFmt w:val="bullet"/>
+      <w:lvlText w:val=""/>
+      <w:lvlJc w:val="left"/>
+      <w:pPr>
+        <w:tabs>
+          <w:tab w:val="num" w:pos="4320"/>
+        </w:tabs>
+        <w:ind w:left="4320" w:hanging="360"/>
+      </w:pPr>
+      <w:rPr>
+        <w:rFonts w:ascii="Symbol" w:hAnsi="Symbol" w:hint="default"/>
+        <w:sz w:val="20"/>
+      </w:rPr>
+    </w:lvl>
+    <w:lvl w:ilvl="6" w:tentative="1">
+      <w:start w:val="1"/>
+      <w:numFmt w:val="bullet"/>
+      <w:lvlText w:val=""/>
+      <w:lvlJc w:val="left"/>
+      <w:pPr>
+        <w:tabs>
+          <w:tab w:val="num" w:pos="5040"/>
+        </w:tabs>
+        <w:ind w:left="5040" w:hanging="360"/>
+      </w:pPr>
+      <w:rPr>
+        <w:rFonts w:ascii="Symbol" w:hAnsi="Symbol" w:hint="default"/>
+        <w:sz w:val="20"/>
+      </w:rPr>
+    </w:lvl>
+    <w:lvl w:ilvl="7" w:tentative="1">
+      <w:start w:val="1"/>
+      <w:numFmt w:val="bullet"/>
+      <w:lvlText w:val=""/>
+      <w:lvlJc w:val="left"/>
+      <w:pPr>
+        <w:tabs>
+          <w:tab w:val="num" w:pos="5760"/>
+        </w:tabs>
+        <w:ind w:left="5760" w:hanging="360"/>
+      </w:pPr>
+      <w:rPr>
+        <w:rFonts w:ascii="Symbol" w:hAnsi="Symbol" w:hint="default"/>
+        <w:sz w:val="20"/>
+      </w:rPr>
+    </w:lvl>
+    <w:lvl w:ilvl="8" w:tentative="1">
+      <w:start w:val="1"/>
+      <w:numFmt w:val="bullet"/>
+      <w:lvlText w:val=""/>
+      <w:lvlJc w:val="left"/>
+      <w:pPr>
+        <w:tabs>
+          <w:tab w:val="num" w:pos="6480"/>
+        </w:tabs>
+        <w:ind w:left="6480" w:hanging="360"/>
+      </w:pPr>
+      <w:rPr>
+        <w:rFonts w:ascii="Symbol" w:hAnsi="Symbol" w:hint="default"/>
+        <w:sz w:val="20"/>
+      </w:rPr>
+    </w:lvl>
+  </w:abstractNum>
+  <w:abstractNum w:abstractNumId="1" w15:restartNumberingAfterBreak="0">
     <w:nsid w:val="57AD4E2B"/>
     <w:multiLevelType w:val="hybridMultilevel"/>
     <w:tmpl w:val="BFC20D02"/>
@@ -2198,7 +3054,7 @@
       </w:pPr>
     </w:lvl>
   </w:abstractNum>
-  <w:abstractNum w:abstractNumId="1" w15:restartNumberingAfterBreak="0">
+  <w:abstractNum w:abstractNumId="2" w15:restartNumberingAfterBreak="0">
     <w:nsid w:val="67283A5B"/>
     <w:multiLevelType w:val="hybridMultilevel"/>
     <w:tmpl w:val="F6FCE64A"/>
@@ -2252,17 +3108,172 @@
       <w:lvlJc w:val="left"/>
     </w:lvl>
   </w:abstractNum>
+  <w:abstractNum w:abstractNumId="3" w15:restartNumberingAfterBreak="0">
+    <w:nsid w:val="6FE907B2"/>
+    <w:multiLevelType w:val="multilevel"/>
+    <w:tmpl w:val="E4BC8424"/>
+    <w:lvl w:ilvl="0">
+      <w:start w:val="1"/>
+      <w:numFmt w:val="bullet"/>
+      <w:lvlText w:val=""/>
+      <w:lvlJc w:val="left"/>
+      <w:pPr>
+        <w:tabs>
+          <w:tab w:val="num" w:pos="720"/>
+        </w:tabs>
+        <w:ind w:left="720" w:hanging="360"/>
+      </w:pPr>
+      <w:rPr>
+        <w:rFonts w:ascii="Symbol" w:hAnsi="Symbol" w:hint="default"/>
+        <w:sz w:val="20"/>
+      </w:rPr>
+    </w:lvl>
+    <w:lvl w:ilvl="1" w:tentative="1">
+      <w:start w:val="1"/>
+      <w:numFmt w:val="bullet"/>
+      <w:lvlText w:val=""/>
+      <w:lvlJc w:val="left"/>
+      <w:pPr>
+        <w:tabs>
+          <w:tab w:val="num" w:pos="1440"/>
+        </w:tabs>
+        <w:ind w:left="1440" w:hanging="360"/>
+      </w:pPr>
+      <w:rPr>
+        <w:rFonts w:ascii="Symbol" w:hAnsi="Symbol" w:hint="default"/>
+        <w:sz w:val="20"/>
+      </w:rPr>
+    </w:lvl>
+    <w:lvl w:ilvl="2" w:tentative="1">
+      <w:start w:val="1"/>
+      <w:numFmt w:val="bullet"/>
+      <w:lvlText w:val=""/>
+      <w:lvlJc w:val="left"/>
+      <w:pPr>
+        <w:tabs>
+          <w:tab w:val="num" w:pos="2160"/>
+        </w:tabs>
+        <w:ind w:left="2160" w:hanging="360"/>
+      </w:pPr>
+      <w:rPr>
+        <w:rFonts w:ascii="Symbol" w:hAnsi="Symbol" w:hint="default"/>
+        <w:sz w:val="20"/>
+      </w:rPr>
+    </w:lvl>
+    <w:lvl w:ilvl="3" w:tentative="1">
+      <w:start w:val="1"/>
+      <w:numFmt w:val="bullet"/>
+      <w:lvlText w:val=""/>
+      <w:lvlJc w:val="left"/>
+      <w:pPr>
+        <w:tabs>
+          <w:tab w:val="num" w:pos="2880"/>
+        </w:tabs>
+        <w:ind w:left="2880" w:hanging="360"/>
+      </w:pPr>
+      <w:rPr>
+        <w:rFonts w:ascii="Symbol" w:hAnsi="Symbol" w:hint="default"/>
+        <w:sz w:val="20"/>
+      </w:rPr>
+    </w:lvl>
+    <w:lvl w:ilvl="4" w:tentative="1">
+      <w:start w:val="1"/>
+      <w:numFmt w:val="bullet"/>
+      <w:lvlText w:val=""/>
+      <w:lvlJc w:val="left"/>
+      <w:pPr>
+        <w:tabs>
+          <w:tab w:val="num" w:pos="3600"/>
+        </w:tabs>
+        <w:ind w:left="3600" w:hanging="360"/>
+      </w:pPr>
+      <w:rPr>
+        <w:rFonts w:ascii="Symbol" w:hAnsi="Symbol" w:hint="default"/>
+        <w:sz w:val="20"/>
+      </w:rPr>
+    </w:lvl>
+    <w:lvl w:ilvl="5" w:tentative="1">
+      <w:start w:val="1"/>
+      <w:numFmt w:val="bullet"/>
+      <w:lvlText w:val=""/>
+      <w:lvlJc w:val="left"/>
+      <w:pPr>
+        <w:tabs>
+          <w:tab w:val="num" w:pos="4320"/>
+        </w:tabs>
+        <w:ind w:left="4320" w:hanging="360"/>
+      </w:pPr>
+      <w:rPr>
+        <w:rFonts w:ascii="Symbol" w:hAnsi="Symbol" w:hint="default"/>
+        <w:sz w:val="20"/>
+      </w:rPr>
+    </w:lvl>
+    <w:lvl w:ilvl="6" w:tentative="1">
+      <w:start w:val="1"/>
+      <w:numFmt w:val="bullet"/>
+      <w:lvlText w:val=""/>
+      <w:lvlJc w:val="left"/>
+      <w:pPr>
+        <w:tabs>
+          <w:tab w:val="num" w:pos="5040"/>
+        </w:tabs>
+        <w:ind w:left="5040" w:hanging="360"/>
+      </w:pPr>
+      <w:rPr>
+        <w:rFonts w:ascii="Symbol" w:hAnsi="Symbol" w:hint="default"/>
+        <w:sz w:val="20"/>
+      </w:rPr>
+    </w:lvl>
+    <w:lvl w:ilvl="7" w:tentative="1">
+      <w:start w:val="1"/>
+      <w:numFmt w:val="bullet"/>
+      <w:lvlText w:val=""/>
+      <w:lvlJc w:val="left"/>
+      <w:pPr>
+        <w:tabs>
+          <w:tab w:val="num" w:pos="5760"/>
+        </w:tabs>
+        <w:ind w:left="5760" w:hanging="360"/>
+      </w:pPr>
+      <w:rPr>
+        <w:rFonts w:ascii="Symbol" w:hAnsi="Symbol" w:hint="default"/>
+        <w:sz w:val="20"/>
+      </w:rPr>
+    </w:lvl>
+    <w:lvl w:ilvl="8" w:tentative="1">
+      <w:start w:val="1"/>
+      <w:numFmt w:val="bullet"/>
+      <w:lvlText w:val=""/>
+      <w:lvlJc w:val="left"/>
+      <w:pPr>
+        <w:tabs>
+          <w:tab w:val="num" w:pos="6480"/>
+        </w:tabs>
+        <w:ind w:left="6480" w:hanging="360"/>
+      </w:pPr>
+      <w:rPr>
+        <w:rFonts w:ascii="Symbol" w:hAnsi="Symbol" w:hint="default"/>
+        <w:sz w:val="20"/>
+      </w:rPr>
+    </w:lvl>
+  </w:abstractNum>
   <w:num w:numId="1" w16cid:durableId="458112080">
-    <w:abstractNumId w:val="0"/>
+    <w:abstractNumId w:val="1"/>
     <w:lvlOverride w:ilvl="0">
       <w:startOverride w:val="1"/>
     </w:lvlOverride>
   </w:num>
   <w:num w:numId="2" w16cid:durableId="1280599314">
-    <w:abstractNumId w:val="1"/>
+    <w:abstractNumId w:val="2"/>
     <w:lvlOverride w:ilvl="0">
       <w:startOverride w:val="1"/>
     </w:lvlOverride>
+  </w:num>
+  <w:num w:numId="3" w16cid:durableId="1602567566">
+    <w:abstractNumId w:val="3"/>
+  </w:num>
+  <w:num w:numId="4" w16cid:durableId="1114519087">
+    <w:abstractNumId w:val="0"/>
   </w:num>
 </w:numbering>
 </file>

</xml_diff>